<commit_message>
Update semester assignment document
Revise the Klycya Silva semester assignment document.
</commit_message>
<xml_diff>
--- a/CA - 1 semestre/KlycyaSilva-2026558.docx
+++ b/CA - 1 semestre/KlycyaSilva-2026558.docx
@@ -847,7 +847,7 @@
             <w:pPr>
               <w:spacing w:line="480" w:lineRule="auto"/>
               <w:rPr>
-                <w:ins w:author="naomie mboma" w:date="2026-04-19T22:08:00Z" w16du:dateUtc="2026-04-19T21:08:00Z" w:id="451408723"/>
+                <w:ins w:author="naomie mboma" w:date="2026-04-19T22:08:00Z" w16du:dateUtc="2026-04-19T21:08:00Z" w:id="442673930"/>
                 <w:i w:val="1"/>
                 <w:iCs w:val="1"/>
                 <w:color w:val="156082"/>
@@ -956,7 +956,8 @@
     <w:p>
       <w:pPr>
         <w:rPr>
-          <w:b/>
+          <w:b w:val="1"/>
+          <w:bCs w:val="1"/>
           <w:sz w:val="28"/>
           <w:szCs w:val="28"/>
         </w:rPr>
@@ -970,26 +971,56 @@
       </w:r>
       <w:r>
         <w:rPr>
-          <w:b/>
+          <w:b w:val="1"/>
+          <w:bCs w:val="1"/>
           <w:sz w:val="28"/>
           <w:szCs w:val="28"/>
         </w:rPr>
-        <w:t>[enter name of the AI tool you used]</w:t>
+        <w:t>[</w:t>
+      </w:r>
+      <w:r>
+        <w:rPr>
+          <w:b w:val="1"/>
+          <w:bCs w:val="1"/>
+          <w:color w:val="FF0000"/>
+          <w:sz w:val="28"/>
+          <w:szCs w:val="28"/>
+        </w:rPr>
+        <w:t>enter name of the AI tool you used]</w:t>
+      </w:r>
+      <w:r>
+        <w:rPr>
+          <w:color w:val="FF0000"/>
+          <w:sz w:val="28"/>
+          <w:szCs w:val="28"/>
+        </w:rPr>
+        <w:t xml:space="preserve"> f</w:t>
       </w:r>
       <w:r>
         <w:rPr>
           <w:sz w:val="28"/>
           <w:szCs w:val="28"/>
         </w:rPr>
-        <w:t xml:space="preserve"> for the purpose of </w:t>
+        <w:t xml:space="preserve">or the purpose of </w:t>
       </w:r>
       <w:r>
         <w:rPr>
-          <w:b/>
+          <w:b w:val="1"/>
+          <w:bCs w:val="1"/>
           <w:sz w:val="28"/>
           <w:szCs w:val="28"/>
         </w:rPr>
-        <w:t xml:space="preserve">[provide a brief explanation of how you used the tool]. </w:t>
+        <w:t>[</w:t>
+      </w:r>
+      <w:r>
+        <w:rPr>
+          <w:b w:val="1"/>
+          <w:bCs w:val="1"/>
+          <w:color w:val="FF0000"/>
+          <w:sz w:val="28"/>
+          <w:szCs w:val="28"/>
+        </w:rPr>
+        <w:t xml:space="preserve">provide a brief explanation of how you used the tool]. </w:t>
       </w:r>
     </w:p>
     <w:p>
@@ -3059,9 +3090,9 @@
         <w:gridCol w:w="245"/>
         <w:gridCol w:w="2204"/>
         <w:gridCol w:w="500"/>
+        <w:gridCol w:w="480"/>
         <w:gridCol w:w="490"/>
-        <w:gridCol w:w="490"/>
-        <w:gridCol w:w="490"/>
+        <w:gridCol w:w="499"/>
         <w:gridCol w:w="505"/>
         <w:gridCol w:w="460"/>
         <w:gridCol w:w="535"/>
@@ -3080,10 +3111,10 @@
           <w:tcPr>
             <w:tcW w:w="245" w:type="dxa"/>
             <w:tcBorders>
-              <w:top w:val="single" w:color="BFBFBF" w:themeColor="background1" w:themeShade="BF" w:sz="6"/>
-              <w:left w:val="single" w:color="BFBFBF" w:themeColor="background1" w:themeShade="BF" w:sz="6"/>
-              <w:bottom w:val="single" w:color="BFBFBF" w:themeColor="background1" w:themeShade="BF" w:sz="6"/>
-              <w:right w:val="single" w:color="BFBFBF" w:themeColor="background1" w:themeShade="BF" w:sz="6"/>
+              <w:top w:val="single" w:color="BFBFBF" w:themeColor="background1" w:themeShade="BF" w:sz="2"/>
+              <w:left w:val="single" w:color="BFBFBF" w:themeColor="background1" w:themeShade="BF" w:sz="2"/>
+              <w:bottom w:val="single" w:color="BFBFBF" w:themeColor="background1" w:themeShade="BF" w:sz="2"/>
+              <w:right w:val="single" w:color="BFBFBF" w:themeColor="background1" w:themeShade="BF" w:sz="2"/>
             </w:tcBorders>
             <w:shd w:val="clear" w:color="auto" w:fill="1F3864"/>
             <w:tcMar>
@@ -3129,10 +3160,10 @@
           <w:tcPr>
             <w:tcW w:w="2204" w:type="dxa"/>
             <w:tcBorders>
-              <w:top w:val="single" w:color="BFBFBF" w:themeColor="background1" w:themeShade="BF" w:sz="6"/>
-              <w:left w:val="single" w:color="BFBFBF" w:themeColor="background1" w:themeShade="BF" w:sz="6"/>
-              <w:bottom w:val="single" w:color="BFBFBF" w:themeColor="background1" w:themeShade="BF" w:sz="6"/>
-              <w:right w:val="single" w:color="000000" w:themeColor="text1" w:sz="12"/>
+              <w:top w:val="single" w:color="BFBFBF" w:themeColor="background1" w:themeShade="BF" w:sz="2"/>
+              <w:left w:val="single" w:color="BFBFBF" w:themeColor="background1" w:themeShade="BF" w:sz="2"/>
+              <w:bottom w:val="single" w:color="BFBFBF" w:themeColor="background1" w:themeShade="BF" w:sz="2"/>
+              <w:right w:val="single" w:color="000000" w:themeColor="text1" w:sz="2"/>
             </w:tcBorders>
             <w:shd w:val="clear" w:color="auto" w:fill="1F3864"/>
             <w:tcMar>
@@ -3179,7 +3210,7 @@
             <w:tcW w:w="500" w:type="dxa"/>
             <w:tcBorders>
               <w:top w:val="single" w:color="BFBFBF" w:themeColor="background1" w:themeShade="BF" w:sz="6"/>
-              <w:left w:val="single" w:color="000000" w:themeColor="text1" w:sz="12"/>
+              <w:left w:val="single" w:color="000000" w:themeColor="text1" w:sz="2"/>
               <w:bottom w:val="nil"/>
               <w:right w:val="single" w:color="BFBFBF" w:themeColor="background1" w:themeShade="BF" w:sz="6"/>
             </w:tcBorders>
@@ -3225,7 +3256,7 @@
         </w:tc>
         <w:tc>
           <w:tcPr>
-            <w:tcW w:w="490" w:type="dxa"/>
+            <w:tcW w:w="480" w:type="dxa"/>
             <w:tcBorders>
               <w:top w:val="single" w:color="BFBFBF" w:themeColor="background1" w:themeShade="BF" w:sz="6"/>
               <w:left w:val="single" w:color="BFBFBF" w:themeColor="background1" w:themeShade="BF" w:sz="6"/>
@@ -3323,7 +3354,7 @@
         </w:tc>
         <w:tc>
           <w:tcPr>
-            <w:tcW w:w="490" w:type="dxa"/>
+            <w:tcW w:w="499" w:type="dxa"/>
             <w:tcBorders>
               <w:top w:val="single" w:color="BFBFBF" w:themeColor="background1" w:themeShade="BF" w:sz="6"/>
               <w:left w:val="single" w:color="BFBFBF" w:themeColor="background1" w:themeShade="BF" w:sz="6"/>
@@ -3820,10 +3851,10 @@
           <w:tcPr>
             <w:tcW w:w="245" w:type="dxa"/>
             <w:tcBorders>
-              <w:top w:val="single" w:color="BFBFBF" w:themeColor="background1" w:themeShade="BF" w:sz="6"/>
-              <w:left w:val="single" w:color="BFBFBF" w:themeColor="background1" w:themeShade="BF" w:sz="6"/>
-              <w:bottom w:val="single" w:color="BFBFBF" w:themeColor="background1" w:themeShade="BF" w:sz="6"/>
-              <w:right w:val="single" w:color="BFBFBF" w:themeColor="background1" w:themeShade="BF" w:sz="6"/>
+              <w:top w:val="single" w:color="BFBFBF" w:themeColor="background1" w:themeShade="BF" w:sz="2"/>
+              <w:left w:val="single" w:color="BFBFBF" w:themeColor="background1" w:themeShade="BF" w:sz="2"/>
+              <w:bottom w:val="single" w:color="BFBFBF" w:themeColor="background1" w:themeShade="BF" w:sz="2"/>
+              <w:right w:val="single" w:color="BFBFBF" w:themeColor="background1" w:themeShade="BF" w:sz="2"/>
             </w:tcBorders>
             <w:tcMar>
               <w:top w:w="45" w:type="dxa"/>
@@ -3866,10 +3897,10 @@
           <w:tcPr>
             <w:tcW w:w="2204" w:type="dxa"/>
             <w:tcBorders>
-              <w:top w:val="single" w:color="BFBFBF" w:themeColor="background1" w:themeShade="BF" w:sz="6"/>
-              <w:left w:val="single" w:color="BFBFBF" w:themeColor="background1" w:themeShade="BF" w:sz="6"/>
-              <w:bottom w:val="single" w:color="BFBFBF" w:themeColor="background1" w:themeShade="BF" w:sz="6"/>
-              <w:right w:val="single" w:color="000000" w:themeColor="text1" w:sz="12"/>
+              <w:top w:val="single" w:color="BFBFBF" w:themeColor="background1" w:themeShade="BF" w:sz="2"/>
+              <w:left w:val="single" w:color="BFBFBF" w:themeColor="background1" w:themeShade="BF" w:sz="2"/>
+              <w:bottom w:val="single" w:color="BFBFBF" w:themeColor="background1" w:themeShade="BF" w:sz="2"/>
+              <w:right w:val="single" w:color="000000" w:themeColor="text1" w:sz="2"/>
             </w:tcBorders>
             <w:tcMar>
               <w:top w:w="45" w:type="dxa"/>
@@ -3913,10 +3944,11 @@
             <w:tcW w:w="500" w:type="dxa"/>
             <w:tcBorders>
               <w:top w:val="nil"/>
-              <w:left w:val="single" w:color="000000" w:themeColor="text1" w:sz="12"/>
-              <w:bottom w:val="nil"/>
-              <w:right w:val="nil"/>
-            </w:tcBorders>
+              <w:left w:val="single" w:color="000000" w:themeColor="text1" w:sz="2"/>
+              <w:bottom w:val="nil"/>
+              <w:right w:val="nil"/>
+            </w:tcBorders>
+            <w:shd w:val="clear" w:color="auto" w:fill="3A7C22" w:themeFill="accent6" w:themeFillShade="BF"/>
             <w:tcMar>
               <w:top w:w="45" w:type="dxa"/>
               <w:left w:w="60" w:type="dxa"/>
@@ -3943,13 +3975,14 @@
         </w:tc>
         <w:tc>
           <w:tcPr>
-            <w:tcW w:w="490" w:type="dxa"/>
-            <w:tcBorders>
-              <w:top w:val="nil"/>
-              <w:left w:val="nil"/>
-              <w:bottom w:val="nil"/>
-              <w:right w:val="nil"/>
-            </w:tcBorders>
+            <w:tcW w:w="480" w:type="dxa"/>
+            <w:tcBorders>
+              <w:top w:val="nil"/>
+              <w:left w:val="nil"/>
+              <w:bottom w:val="nil"/>
+              <w:right w:val="nil"/>
+            </w:tcBorders>
+            <w:shd w:val="clear" w:color="auto" w:fill="3A7C22" w:themeFill="accent6" w:themeFillShade="BF"/>
             <w:tcMar>
               <w:top w:w="45" w:type="dxa"/>
               <w:left w:w="60" w:type="dxa"/>
@@ -4009,7 +4042,7 @@
         </w:tc>
         <w:tc>
           <w:tcPr>
-            <w:tcW w:w="490" w:type="dxa"/>
+            <w:tcW w:w="499" w:type="dxa"/>
             <w:tcBorders>
               <w:top w:val="nil"/>
               <w:left w:val="nil"/>
@@ -4347,10 +4380,10 @@
           <w:tcPr>
             <w:tcW w:w="245" w:type="dxa"/>
             <w:tcBorders>
-              <w:top w:val="single" w:color="BFBFBF" w:themeColor="background1" w:themeShade="BF" w:sz="6"/>
-              <w:left w:val="single" w:color="BFBFBF" w:themeColor="background1" w:themeShade="BF" w:sz="6"/>
-              <w:bottom w:val="single" w:color="BFBFBF" w:themeColor="background1" w:themeShade="BF" w:sz="6"/>
-              <w:right w:val="single" w:color="BFBFBF" w:themeColor="background1" w:themeShade="BF" w:sz="6"/>
+              <w:top w:val="single" w:color="BFBFBF" w:themeColor="background1" w:themeShade="BF" w:sz="2"/>
+              <w:left w:val="single" w:color="BFBFBF" w:themeColor="background1" w:themeShade="BF" w:sz="2"/>
+              <w:bottom w:val="single" w:color="BFBFBF" w:themeColor="background1" w:themeShade="BF" w:sz="2"/>
+              <w:right w:val="single" w:color="BFBFBF" w:themeColor="background1" w:themeShade="BF" w:sz="2"/>
             </w:tcBorders>
             <w:tcMar>
               <w:top w:w="45" w:type="dxa"/>
@@ -4393,10 +4426,10 @@
           <w:tcPr>
             <w:tcW w:w="2204" w:type="dxa"/>
             <w:tcBorders>
-              <w:top w:val="single" w:color="BFBFBF" w:themeColor="background1" w:themeShade="BF" w:sz="6"/>
-              <w:left w:val="single" w:color="BFBFBF" w:themeColor="background1" w:themeShade="BF" w:sz="6"/>
-              <w:bottom w:val="single" w:color="BFBFBF" w:themeColor="background1" w:themeShade="BF" w:sz="6"/>
-              <w:right w:val="single" w:color="000000" w:themeColor="text1" w:sz="12"/>
+              <w:top w:val="single" w:color="BFBFBF" w:themeColor="background1" w:themeShade="BF" w:sz="2"/>
+              <w:left w:val="single" w:color="BFBFBF" w:themeColor="background1" w:themeShade="BF" w:sz="2"/>
+              <w:bottom w:val="single" w:color="BFBFBF" w:themeColor="background1" w:themeShade="BF" w:sz="2"/>
+              <w:right w:val="single" w:color="000000" w:themeColor="text1" w:sz="2"/>
             </w:tcBorders>
             <w:tcMar>
               <w:top w:w="45" w:type="dxa"/>
@@ -4440,7 +4473,7 @@
             <w:tcW w:w="500" w:type="dxa"/>
             <w:tcBorders>
               <w:top w:val="nil"/>
-              <w:left w:val="single" w:color="000000" w:themeColor="text1" w:sz="12"/>
+              <w:left w:val="single" w:color="000000" w:themeColor="text1" w:sz="2"/>
               <w:bottom w:val="nil"/>
               <w:right w:val="nil"/>
             </w:tcBorders>
@@ -4470,13 +4503,14 @@
         </w:tc>
         <w:tc>
           <w:tcPr>
-            <w:tcW w:w="490" w:type="dxa"/>
-            <w:tcBorders>
-              <w:top w:val="nil"/>
-              <w:left w:val="nil"/>
-              <w:bottom w:val="nil"/>
-              <w:right w:val="nil"/>
-            </w:tcBorders>
+            <w:tcW w:w="480" w:type="dxa"/>
+            <w:tcBorders>
+              <w:top w:val="nil"/>
+              <w:left w:val="nil"/>
+              <w:bottom w:val="nil"/>
+              <w:right w:val="nil"/>
+            </w:tcBorders>
+            <w:shd w:val="clear" w:color="auto" w:fill="3A7C22" w:themeFill="accent6" w:themeFillShade="BF"/>
             <w:tcMar>
               <w:top w:w="45" w:type="dxa"/>
               <w:left w:w="60" w:type="dxa"/>
@@ -4538,7 +4572,7 @@
         </w:tc>
         <w:tc>
           <w:tcPr>
-            <w:tcW w:w="490" w:type="dxa"/>
+            <w:tcW w:w="499" w:type="dxa"/>
             <w:tcBorders>
               <w:top w:val="nil"/>
               <w:left w:val="nil"/>
@@ -4878,10 +4912,10 @@
           <w:tcPr>
             <w:tcW w:w="245" w:type="dxa"/>
             <w:tcBorders>
-              <w:top w:val="single" w:color="BFBFBF" w:themeColor="background1" w:themeShade="BF" w:sz="6"/>
-              <w:left w:val="single" w:color="BFBFBF" w:themeColor="background1" w:themeShade="BF" w:sz="6"/>
-              <w:bottom w:val="single" w:color="BFBFBF" w:themeColor="background1" w:themeShade="BF" w:sz="6"/>
-              <w:right w:val="single" w:color="BFBFBF" w:themeColor="background1" w:themeShade="BF" w:sz="6"/>
+              <w:top w:val="single" w:color="BFBFBF" w:themeColor="background1" w:themeShade="BF" w:sz="2"/>
+              <w:left w:val="single" w:color="BFBFBF" w:themeColor="background1" w:themeShade="BF" w:sz="2"/>
+              <w:bottom w:val="single" w:color="BFBFBF" w:themeColor="background1" w:themeShade="BF" w:sz="2"/>
+              <w:right w:val="single" w:color="BFBFBF" w:themeColor="background1" w:themeShade="BF" w:sz="2"/>
             </w:tcBorders>
             <w:tcMar>
               <w:top w:w="45" w:type="dxa"/>
@@ -4924,10 +4958,10 @@
           <w:tcPr>
             <w:tcW w:w="2204" w:type="dxa"/>
             <w:tcBorders>
-              <w:top w:val="single" w:color="BFBFBF" w:themeColor="background1" w:themeShade="BF" w:sz="6"/>
-              <w:left w:val="single" w:color="BFBFBF" w:themeColor="background1" w:themeShade="BF" w:sz="6"/>
-              <w:bottom w:val="single" w:color="BFBFBF" w:themeColor="background1" w:themeShade="BF" w:sz="6"/>
-              <w:right w:val="single" w:color="000000" w:themeColor="text1" w:sz="12"/>
+              <w:top w:val="single" w:color="BFBFBF" w:themeColor="background1" w:themeShade="BF" w:sz="2"/>
+              <w:left w:val="single" w:color="BFBFBF" w:themeColor="background1" w:themeShade="BF" w:sz="2"/>
+              <w:bottom w:val="single" w:color="BFBFBF" w:themeColor="background1" w:themeShade="BF" w:sz="2"/>
+              <w:right w:val="single" w:color="000000" w:themeColor="text1" w:sz="2"/>
             </w:tcBorders>
             <w:tcMar>
               <w:top w:w="45" w:type="dxa"/>
@@ -4971,7 +5005,7 @@
             <w:tcW w:w="500" w:type="dxa"/>
             <w:tcBorders>
               <w:top w:val="nil"/>
-              <w:left w:val="single" w:color="000000" w:themeColor="text1" w:sz="12"/>
+              <w:left w:val="single" w:color="000000" w:themeColor="text1" w:sz="2"/>
               <w:bottom w:val="nil"/>
               <w:right w:val="nil"/>
             </w:tcBorders>
@@ -5001,13 +5035,14 @@
         </w:tc>
         <w:tc>
           <w:tcPr>
-            <w:tcW w:w="490" w:type="dxa"/>
-            <w:tcBorders>
-              <w:top w:val="nil"/>
-              <w:left w:val="nil"/>
-              <w:bottom w:val="nil"/>
-              <w:right w:val="nil"/>
-            </w:tcBorders>
+            <w:tcW w:w="480" w:type="dxa"/>
+            <w:tcBorders>
+              <w:top w:val="nil"/>
+              <w:left w:val="nil"/>
+              <w:bottom w:val="nil"/>
+              <w:right w:val="nil"/>
+            </w:tcBorders>
+            <w:shd w:val="clear" w:color="auto" w:fill="3A7C22" w:themeFill="accent6" w:themeFillShade="BF"/>
             <w:tcMar>
               <w:top w:w="45" w:type="dxa"/>
               <w:left w:w="60" w:type="dxa"/>
@@ -5067,7 +5102,7 @@
         </w:tc>
         <w:tc>
           <w:tcPr>
-            <w:tcW w:w="490" w:type="dxa"/>
+            <w:tcW w:w="499" w:type="dxa"/>
             <w:tcBorders>
               <w:top w:val="nil"/>
               <w:left w:val="nil"/>
@@ -5408,10 +5443,10 @@
           <w:tcPr>
             <w:tcW w:w="245" w:type="dxa"/>
             <w:tcBorders>
-              <w:top w:val="single" w:color="BFBFBF" w:themeColor="background1" w:themeShade="BF" w:sz="6"/>
-              <w:left w:val="single" w:color="BFBFBF" w:themeColor="background1" w:themeShade="BF" w:sz="6"/>
-              <w:bottom w:val="single" w:color="BFBFBF" w:themeColor="background1" w:themeShade="BF" w:sz="6"/>
-              <w:right w:val="single" w:color="BFBFBF" w:themeColor="background1" w:themeShade="BF" w:sz="6"/>
+              <w:top w:val="single" w:color="BFBFBF" w:themeColor="background1" w:themeShade="BF" w:sz="2"/>
+              <w:left w:val="single" w:color="BFBFBF" w:themeColor="background1" w:themeShade="BF" w:sz="2"/>
+              <w:bottom w:val="single" w:color="BFBFBF" w:themeColor="background1" w:themeShade="BF" w:sz="2"/>
+              <w:right w:val="single" w:color="BFBFBF" w:themeColor="background1" w:themeShade="BF" w:sz="2"/>
             </w:tcBorders>
             <w:tcMar>
               <w:top w:w="45" w:type="dxa"/>
@@ -5454,10 +5489,10 @@
           <w:tcPr>
             <w:tcW w:w="2204" w:type="dxa"/>
             <w:tcBorders>
-              <w:top w:val="single" w:color="BFBFBF" w:themeColor="background1" w:themeShade="BF" w:sz="6"/>
-              <w:left w:val="single" w:color="BFBFBF" w:themeColor="background1" w:themeShade="BF" w:sz="6"/>
-              <w:bottom w:val="single" w:color="BFBFBF" w:themeColor="background1" w:themeShade="BF" w:sz="6"/>
-              <w:right w:val="single" w:color="000000" w:themeColor="text1" w:sz="12"/>
+              <w:top w:val="single" w:color="BFBFBF" w:themeColor="background1" w:themeShade="BF" w:sz="2"/>
+              <w:left w:val="single" w:color="BFBFBF" w:themeColor="background1" w:themeShade="BF" w:sz="2"/>
+              <w:bottom w:val="single" w:color="BFBFBF" w:themeColor="background1" w:themeShade="BF" w:sz="2"/>
+              <w:right w:val="single" w:color="000000" w:themeColor="text1" w:sz="2"/>
             </w:tcBorders>
             <w:tcMar>
               <w:top w:w="45" w:type="dxa"/>
@@ -5501,7 +5536,7 @@
             <w:tcW w:w="500" w:type="dxa"/>
             <w:tcBorders>
               <w:top w:val="nil"/>
-              <w:left w:val="single" w:color="000000" w:themeColor="text1" w:sz="12"/>
+              <w:left w:val="single" w:color="000000" w:themeColor="text1" w:sz="2"/>
               <w:bottom w:val="nil"/>
               <w:right w:val="nil"/>
             </w:tcBorders>
@@ -5531,13 +5566,14 @@
         </w:tc>
         <w:tc>
           <w:tcPr>
-            <w:tcW w:w="490" w:type="dxa"/>
-            <w:tcBorders>
-              <w:top w:val="nil"/>
-              <w:left w:val="nil"/>
-              <w:bottom w:val="nil"/>
-              <w:right w:val="nil"/>
-            </w:tcBorders>
+            <w:tcW w:w="480" w:type="dxa"/>
+            <w:tcBorders>
+              <w:top w:val="nil"/>
+              <w:left w:val="nil"/>
+              <w:bottom w:val="nil"/>
+              <w:right w:val="nil"/>
+            </w:tcBorders>
+            <w:shd w:val="clear" w:color="auto" w:fill="3A7C22" w:themeFill="accent6" w:themeFillShade="BF"/>
             <w:tcMar>
               <w:top w:w="45" w:type="dxa"/>
               <w:left w:w="60" w:type="dxa"/>
@@ -5597,7 +5633,7 @@
         </w:tc>
         <w:tc>
           <w:tcPr>
-            <w:tcW w:w="490" w:type="dxa"/>
+            <w:tcW w:w="499" w:type="dxa"/>
             <w:tcBorders>
               <w:top w:val="nil"/>
               <w:left w:val="nil"/>
@@ -5937,10 +5973,10 @@
           <w:tcPr>
             <w:tcW w:w="245" w:type="dxa"/>
             <w:tcBorders>
-              <w:top w:val="single" w:color="BFBFBF" w:themeColor="background1" w:themeShade="BF" w:sz="6"/>
-              <w:left w:val="single" w:color="BFBFBF" w:themeColor="background1" w:themeShade="BF" w:sz="6"/>
-              <w:bottom w:val="single" w:color="BFBFBF" w:themeColor="background1" w:themeShade="BF" w:sz="6"/>
-              <w:right w:val="single" w:color="BFBFBF" w:themeColor="background1" w:themeShade="BF" w:sz="6"/>
+              <w:top w:val="single" w:color="BFBFBF" w:themeColor="background1" w:themeShade="BF" w:sz="2"/>
+              <w:left w:val="single" w:color="BFBFBF" w:themeColor="background1" w:themeShade="BF" w:sz="2"/>
+              <w:bottom w:val="single" w:color="BFBFBF" w:themeColor="background1" w:themeShade="BF" w:sz="2"/>
+              <w:right w:val="single" w:color="BFBFBF" w:themeColor="background1" w:themeShade="BF" w:sz="2"/>
             </w:tcBorders>
             <w:tcMar>
               <w:top w:w="45" w:type="dxa"/>
@@ -5983,10 +6019,10 @@
           <w:tcPr>
             <w:tcW w:w="2204" w:type="dxa"/>
             <w:tcBorders>
-              <w:top w:val="single" w:color="BFBFBF" w:themeColor="background1" w:themeShade="BF" w:sz="6"/>
-              <w:left w:val="single" w:color="BFBFBF" w:themeColor="background1" w:themeShade="BF" w:sz="6"/>
-              <w:bottom w:val="single" w:color="BFBFBF" w:themeColor="background1" w:themeShade="BF" w:sz="6"/>
-              <w:right w:val="single" w:color="000000" w:themeColor="text1" w:sz="12"/>
+              <w:top w:val="single" w:color="BFBFBF" w:themeColor="background1" w:themeShade="BF" w:sz="2"/>
+              <w:left w:val="single" w:color="BFBFBF" w:themeColor="background1" w:themeShade="BF" w:sz="2"/>
+              <w:bottom w:val="single" w:color="BFBFBF" w:themeColor="background1" w:themeShade="BF" w:sz="2"/>
+              <w:right w:val="single" w:color="000000" w:themeColor="text1" w:sz="2"/>
             </w:tcBorders>
             <w:tcMar>
               <w:top w:w="45" w:type="dxa"/>
@@ -6030,7 +6066,7 @@
             <w:tcW w:w="500" w:type="dxa"/>
             <w:tcBorders>
               <w:top w:val="nil"/>
-              <w:left w:val="single" w:color="000000" w:themeColor="text1" w:sz="12"/>
+              <w:left w:val="single" w:color="000000" w:themeColor="text1" w:sz="2"/>
               <w:bottom w:val="nil"/>
               <w:right w:val="nil"/>
             </w:tcBorders>
@@ -6060,13 +6096,14 @@
         </w:tc>
         <w:tc>
           <w:tcPr>
-            <w:tcW w:w="490" w:type="dxa"/>
-            <w:tcBorders>
-              <w:top w:val="nil"/>
-              <w:left w:val="nil"/>
-              <w:bottom w:val="nil"/>
-              <w:right w:val="nil"/>
-            </w:tcBorders>
+            <w:tcW w:w="480" w:type="dxa"/>
+            <w:tcBorders>
+              <w:top w:val="nil"/>
+              <w:left w:val="nil"/>
+              <w:bottom w:val="nil"/>
+              <w:right w:val="nil"/>
+            </w:tcBorders>
+            <w:shd w:val="clear" w:color="auto" w:fill="3A7C22" w:themeFill="accent6" w:themeFillShade="BF"/>
             <w:tcMar>
               <w:top w:w="45" w:type="dxa"/>
               <w:left w:w="60" w:type="dxa"/>
@@ -6127,7 +6164,7 @@
         </w:tc>
         <w:tc>
           <w:tcPr>
-            <w:tcW w:w="490" w:type="dxa"/>
+            <w:tcW w:w="499" w:type="dxa"/>
             <w:tcBorders>
               <w:top w:val="nil"/>
               <w:left w:val="nil"/>
@@ -6468,10 +6505,10 @@
           <w:tcPr>
             <w:tcW w:w="245" w:type="dxa"/>
             <w:tcBorders>
-              <w:top w:val="single" w:color="BFBFBF" w:themeColor="background1" w:themeShade="BF" w:sz="6"/>
-              <w:left w:val="single" w:color="BFBFBF" w:themeColor="background1" w:themeShade="BF" w:sz="6"/>
-              <w:bottom w:val="single" w:color="BFBFBF" w:themeColor="background1" w:themeShade="BF" w:sz="6"/>
-              <w:right w:val="single" w:color="BFBFBF" w:themeColor="background1" w:themeShade="BF" w:sz="6"/>
+              <w:top w:val="single" w:color="BFBFBF" w:themeColor="background1" w:themeShade="BF" w:sz="2"/>
+              <w:left w:val="single" w:color="BFBFBF" w:themeColor="background1" w:themeShade="BF" w:sz="2"/>
+              <w:bottom w:val="single" w:color="BFBFBF" w:themeColor="background1" w:themeShade="BF" w:sz="2"/>
+              <w:right w:val="single" w:color="BFBFBF" w:themeColor="background1" w:themeShade="BF" w:sz="2"/>
             </w:tcBorders>
             <w:tcMar>
               <w:top w:w="45" w:type="dxa"/>
@@ -6514,10 +6551,10 @@
           <w:tcPr>
             <w:tcW w:w="2204" w:type="dxa"/>
             <w:tcBorders>
-              <w:top w:val="single" w:color="BFBFBF" w:themeColor="background1" w:themeShade="BF" w:sz="6"/>
-              <w:left w:val="single" w:color="BFBFBF" w:themeColor="background1" w:themeShade="BF" w:sz="6"/>
-              <w:bottom w:val="single" w:color="BFBFBF" w:themeColor="background1" w:themeShade="BF" w:sz="6"/>
-              <w:right w:val="single" w:color="000000" w:themeColor="text1" w:sz="12"/>
+              <w:top w:val="single" w:color="BFBFBF" w:themeColor="background1" w:themeShade="BF" w:sz="2"/>
+              <w:left w:val="single" w:color="BFBFBF" w:themeColor="background1" w:themeShade="BF" w:sz="2"/>
+              <w:bottom w:val="single" w:color="BFBFBF" w:themeColor="background1" w:themeShade="BF" w:sz="2"/>
+              <w:right w:val="single" w:color="000000" w:themeColor="text1" w:sz="2"/>
             </w:tcBorders>
             <w:tcMar>
               <w:top w:w="45" w:type="dxa"/>
@@ -6561,7 +6598,7 @@
             <w:tcW w:w="500" w:type="dxa"/>
             <w:tcBorders>
               <w:top w:val="nil"/>
-              <w:left w:val="single" w:color="000000" w:themeColor="text1" w:sz="12"/>
+              <w:left w:val="single" w:color="000000" w:themeColor="text1" w:sz="2"/>
               <w:bottom w:val="nil"/>
               <w:right w:val="nil"/>
             </w:tcBorders>
@@ -6592,13 +6629,14 @@
         </w:tc>
         <w:tc>
           <w:tcPr>
-            <w:tcW w:w="490" w:type="dxa"/>
-            <w:tcBorders>
-              <w:top w:val="nil"/>
-              <w:left w:val="nil"/>
-              <w:bottom w:val="nil"/>
-              <w:right w:val="nil"/>
-            </w:tcBorders>
+            <w:tcW w:w="480" w:type="dxa"/>
+            <w:tcBorders>
+              <w:top w:val="nil"/>
+              <w:left w:val="nil"/>
+              <w:bottom w:val="nil"/>
+              <w:right w:val="nil"/>
+            </w:tcBorders>
+            <w:shd w:val="clear" w:color="auto" w:fill="3A7C22" w:themeFill="accent6" w:themeFillShade="BF"/>
             <w:tcMar>
               <w:top w:w="45" w:type="dxa"/>
               <w:left w:w="60" w:type="dxa"/>
@@ -6658,7 +6696,7 @@
         </w:tc>
         <w:tc>
           <w:tcPr>
-            <w:tcW w:w="490" w:type="dxa"/>
+            <w:tcW w:w="499" w:type="dxa"/>
             <w:tcBorders>
               <w:top w:val="nil"/>
               <w:left w:val="nil"/>
@@ -6998,10 +7036,10 @@
           <w:tcPr>
             <w:tcW w:w="245" w:type="dxa"/>
             <w:tcBorders>
-              <w:top w:val="single" w:color="BFBFBF" w:themeColor="background1" w:themeShade="BF" w:sz="6"/>
-              <w:left w:val="single" w:color="BFBFBF" w:themeColor="background1" w:themeShade="BF" w:sz="6"/>
-              <w:bottom w:val="single" w:color="BFBFBF" w:themeColor="background1" w:themeShade="BF" w:sz="6"/>
-              <w:right w:val="single" w:color="BFBFBF" w:themeColor="background1" w:themeShade="BF" w:sz="6"/>
+              <w:top w:val="single" w:color="BFBFBF" w:themeColor="background1" w:themeShade="BF" w:sz="2"/>
+              <w:left w:val="single" w:color="BFBFBF" w:themeColor="background1" w:themeShade="BF" w:sz="2"/>
+              <w:bottom w:val="single" w:color="BFBFBF" w:themeColor="background1" w:themeShade="BF" w:sz="2"/>
+              <w:right w:val="single" w:color="BFBFBF" w:themeColor="background1" w:themeShade="BF" w:sz="2"/>
             </w:tcBorders>
             <w:tcMar>
               <w:top w:w="45" w:type="dxa"/>
@@ -7044,36 +7082,22 @@
           <w:tcPr>
             <w:tcW w:w="2204" w:type="dxa"/>
             <w:tcBorders>
-              <w:top w:val="single" w:color="BFBFBF" w:themeColor="background1" w:themeShade="BF" w:sz="6"/>
-              <w:left w:val="single" w:color="BFBFBF" w:themeColor="background1" w:themeShade="BF" w:sz="6"/>
-              <w:bottom w:val="single" w:color="BFBFBF" w:themeColor="background1" w:themeShade="BF" w:sz="6"/>
-              <w:right w:val="single" w:color="000000" w:themeColor="text1" w:sz="12"/>
-            </w:tcBorders>
-            <w:tcMar>
-              <w:top w:w="45" w:type="dxa"/>
-              <w:left w:w="60" w:type="dxa"/>
-              <w:bottom w:w="45" w:type="dxa"/>
-              <w:right w:w="60" w:type="dxa"/>
-            </w:tcMar>
-            <w:vAlign w:val="top"/>
-          </w:tcPr>
-          <w:p>
-            <w:pPr>
-              <w:spacing w:before="0" w:after="0"/>
-              <w:jc w:val="left"/>
-              <w:rPr>
-                <w:rFonts w:ascii="Arial" w:hAnsi="Arial" w:eastAsia="Arial" w:cs="Arial"/>
-                <w:b w:val="0"/>
-                <w:bCs w:val="0"/>
-                <w:i w:val="0"/>
-                <w:iCs w:val="0"/>
-                <w:sz w:val="18"/>
-                <w:szCs w:val="18"/>
-              </w:rPr>
-            </w:pPr>
-          </w:p>
-          <w:p>
-            <w:pPr>
+              <w:top w:val="single" w:color="BFBFBF" w:themeColor="background1" w:themeShade="BF" w:sz="2"/>
+              <w:left w:val="single" w:color="BFBFBF" w:themeColor="background1" w:themeShade="BF" w:sz="2"/>
+              <w:bottom w:val="single" w:color="BFBFBF" w:themeColor="background1" w:themeShade="BF" w:sz="2"/>
+              <w:right w:val="single" w:color="000000" w:themeColor="text1" w:sz="2"/>
+            </w:tcBorders>
+            <w:tcMar>
+              <w:top w:w="45" w:type="dxa"/>
+              <w:left w:w="60" w:type="dxa"/>
+              <w:bottom w:w="45" w:type="dxa"/>
+              <w:right w:w="60" w:type="dxa"/>
+            </w:tcMar>
+            <w:vAlign w:val="top"/>
+          </w:tcPr>
+          <w:p>
+            <w:pPr>
+              <w:pStyle w:val="Normal"/>
               <w:spacing w:before="0" w:after="0"/>
               <w:jc w:val="left"/>
               <w:rPr>
@@ -7106,7 +7130,7 @@
             <w:tcW w:w="500" w:type="dxa"/>
             <w:tcBorders>
               <w:top w:val="nil"/>
-              <w:left w:val="single" w:color="000000" w:themeColor="text1" w:sz="12"/>
+              <w:left w:val="single" w:color="000000" w:themeColor="text1" w:sz="2"/>
               <w:bottom w:val="nil"/>
               <w:right w:val="nil"/>
             </w:tcBorders>
@@ -7136,13 +7160,14 @@
         </w:tc>
         <w:tc>
           <w:tcPr>
-            <w:tcW w:w="490" w:type="dxa"/>
-            <w:tcBorders>
-              <w:top w:val="nil"/>
-              <w:left w:val="nil"/>
-              <w:bottom w:val="nil"/>
-              <w:right w:val="nil"/>
-            </w:tcBorders>
+            <w:tcW w:w="480" w:type="dxa"/>
+            <w:tcBorders>
+              <w:top w:val="nil"/>
+              <w:left w:val="nil"/>
+              <w:bottom w:val="nil"/>
+              <w:right w:val="nil"/>
+            </w:tcBorders>
+            <w:shd w:val="clear" w:color="auto" w:fill="3A7C22" w:themeFill="accent6" w:themeFillShade="BF"/>
             <w:tcMar>
               <w:top w:w="45" w:type="dxa"/>
               <w:left w:w="60" w:type="dxa"/>
@@ -7202,7 +7227,7 @@
         </w:tc>
         <w:tc>
           <w:tcPr>
-            <w:tcW w:w="490" w:type="dxa"/>
+            <w:tcW w:w="499" w:type="dxa"/>
             <w:tcBorders>
               <w:top w:val="nil"/>
               <w:left w:val="nil"/>
@@ -7544,10 +7569,10 @@
           <w:tcPr>
             <w:tcW w:w="245" w:type="dxa"/>
             <w:tcBorders>
-              <w:top w:val="single" w:color="BFBFBF" w:themeColor="background1" w:themeShade="BF" w:sz="6"/>
-              <w:left w:val="single" w:color="BFBFBF" w:themeColor="background1" w:themeShade="BF" w:sz="6"/>
-              <w:bottom w:val="single" w:color="BFBFBF" w:themeColor="background1" w:themeShade="BF" w:sz="6"/>
-              <w:right w:val="single" w:color="BFBFBF" w:themeColor="background1" w:themeShade="BF" w:sz="6"/>
+              <w:top w:val="single" w:color="BFBFBF" w:themeColor="background1" w:themeShade="BF" w:sz="2"/>
+              <w:left w:val="single" w:color="BFBFBF" w:themeColor="background1" w:themeShade="BF" w:sz="2"/>
+              <w:bottom w:val="single" w:color="BFBFBF" w:themeColor="background1" w:themeShade="BF" w:sz="2"/>
+              <w:right w:val="single" w:color="BFBFBF" w:themeColor="background1" w:themeShade="BF" w:sz="2"/>
             </w:tcBorders>
             <w:tcMar>
               <w:top w:w="45" w:type="dxa"/>
@@ -7590,42 +7615,42 @@
           <w:tcPr>
             <w:tcW w:w="2204" w:type="dxa"/>
             <w:tcBorders>
-              <w:top w:val="single" w:color="BFBFBF" w:themeColor="background1" w:themeShade="BF" w:sz="6"/>
-              <w:left w:val="single" w:color="BFBFBF" w:themeColor="background1" w:themeShade="BF" w:sz="6"/>
-              <w:bottom w:val="single" w:color="BFBFBF" w:themeColor="background1" w:themeShade="BF" w:sz="6"/>
-              <w:right w:val="single" w:color="000000" w:themeColor="text1" w:sz="12"/>
-            </w:tcBorders>
-            <w:tcMar>
-              <w:top w:w="45" w:type="dxa"/>
-              <w:left w:w="60" w:type="dxa"/>
-              <w:bottom w:w="45" w:type="dxa"/>
-              <w:right w:w="60" w:type="dxa"/>
-            </w:tcMar>
-            <w:vAlign w:val="top"/>
-          </w:tcPr>
-          <w:p>
-            <w:pPr>
-              <w:spacing w:before="0" w:after="0"/>
-              <w:jc w:val="center"/>
-              <w:rPr>
-                <w:rFonts w:ascii="Arial" w:hAnsi="Arial" w:eastAsia="Arial" w:cs="Arial"/>
-                <w:b w:val="0"/>
-                <w:bCs w:val="0"/>
-                <w:i w:val="0"/>
-                <w:iCs w:val="0"/>
-                <w:sz w:val="20"/>
-                <w:szCs w:val="20"/>
+              <w:top w:val="single" w:color="BFBFBF" w:themeColor="background1" w:themeShade="BF" w:sz="2"/>
+              <w:left w:val="single" w:color="BFBFBF" w:themeColor="background1" w:themeShade="BF" w:sz="2"/>
+              <w:bottom w:val="single" w:color="BFBFBF" w:themeColor="background1" w:themeShade="BF" w:sz="2"/>
+              <w:right w:val="single" w:color="000000" w:themeColor="text1" w:sz="2"/>
+            </w:tcBorders>
+            <w:tcMar>
+              <w:top w:w="45" w:type="dxa"/>
+              <w:left w:w="60" w:type="dxa"/>
+              <w:bottom w:w="45" w:type="dxa"/>
+              <w:right w:w="60" w:type="dxa"/>
+            </w:tcMar>
+            <w:vAlign w:val="top"/>
+          </w:tcPr>
+          <w:p>
+            <w:pPr>
+              <w:spacing w:before="0" w:after="0"/>
+              <w:jc w:val="left"/>
+              <w:rPr>
+                <w:rFonts w:ascii="Arial" w:hAnsi="Arial" w:eastAsia="Arial" w:cs="Arial"/>
+                <w:b w:val="0"/>
+                <w:bCs w:val="0"/>
+                <w:i w:val="0"/>
+                <w:iCs w:val="0"/>
+                <w:sz w:val="18"/>
+                <w:szCs w:val="18"/>
               </w:rPr>
             </w:pPr>
             <w:r>
               <w:rPr>
                 <w:rFonts w:ascii="Arial" w:hAnsi="Arial" w:eastAsia="Arial" w:cs="Arial"/>
-                <w:b w:val="1"/>
-                <w:bCs w:val="1"/>
-                <w:i w:val="0"/>
-                <w:iCs w:val="0"/>
-                <w:sz w:val="20"/>
-                <w:szCs w:val="20"/>
+                <w:b w:val="0"/>
+                <w:bCs w:val="0"/>
+                <w:i w:val="0"/>
+                <w:iCs w:val="0"/>
+                <w:sz w:val="18"/>
+                <w:szCs w:val="18"/>
                 <w:lang w:val="en-IE"/>
               </w:rPr>
               <w:t>Baseline model</w:t>
@@ -7634,15 +7659,15 @@
           <w:p>
             <w:pPr>
               <w:spacing w:before="0" w:after="0"/>
-              <w:jc w:val="center"/>
-              <w:rPr>
-                <w:rFonts w:ascii="Arial" w:hAnsi="Arial" w:eastAsia="Arial" w:cs="Arial"/>
-                <w:b w:val="0"/>
-                <w:bCs w:val="0"/>
-                <w:i w:val="0"/>
-                <w:iCs w:val="0"/>
-                <w:sz w:val="17"/>
-                <w:szCs w:val="17"/>
+              <w:jc w:val="left"/>
+              <w:rPr>
+                <w:rFonts w:ascii="Arial" w:hAnsi="Arial" w:eastAsia="Arial" w:cs="Arial"/>
+                <w:b w:val="0"/>
+                <w:bCs w:val="0"/>
+                <w:i w:val="0"/>
+                <w:iCs w:val="0"/>
+                <w:sz w:val="18"/>
+                <w:szCs w:val="18"/>
               </w:rPr>
             </w:pPr>
             <w:r>
@@ -7652,17 +7677,35 @@
                 <w:bCs w:val="0"/>
                 <w:i w:val="0"/>
                 <w:iCs w:val="0"/>
-                <w:sz w:val="17"/>
-                <w:szCs w:val="17"/>
+                <w:sz w:val="18"/>
+                <w:szCs w:val="18"/>
                 <w:lang w:val="en-IE"/>
               </w:rPr>
               <w:t>Linear regression</w:t>
             </w:r>
           </w:p>
-          <w:p>
-            <w:pPr>
-              <w:spacing w:before="0" w:after="0"/>
-              <w:jc w:val="left"/>
+        </w:tc>
+        <w:tc>
+          <w:tcPr>
+            <w:tcW w:w="500" w:type="dxa"/>
+            <w:tcBorders>
+              <w:top w:val="nil"/>
+              <w:left w:val="single" w:color="000000" w:themeColor="text1" w:sz="2"/>
+              <w:bottom w:val="nil"/>
+              <w:right w:val="nil"/>
+            </w:tcBorders>
+            <w:tcMar>
+              <w:top w:w="45" w:type="dxa"/>
+              <w:left w:w="60" w:type="dxa"/>
+              <w:bottom w:w="45" w:type="dxa"/>
+              <w:right w:w="60" w:type="dxa"/>
+            </w:tcMar>
+            <w:vAlign w:val="top"/>
+          </w:tcPr>
+          <w:p>
+            <w:pPr>
+              <w:spacing w:before="0" w:after="0"/>
+              <w:jc w:val="center"/>
               <w:rPr>
                 <w:rFonts w:ascii="Arial" w:hAnsi="Arial" w:eastAsia="Arial" w:cs="Arial"/>
                 <w:b w:val="0"/>
@@ -7671,17 +7714,16 @@
                 <w:iCs w:val="0"/>
                 <w:sz w:val="18"/>
                 <w:szCs w:val="18"/>
-                <w:lang w:val="en-US"/>
-              </w:rPr>
-            </w:pPr>
-          </w:p>
-        </w:tc>
-        <w:tc>
-          <w:tcPr>
-            <w:tcW w:w="500" w:type="dxa"/>
-            <w:tcBorders>
-              <w:top w:val="nil"/>
-              <w:left w:val="single" w:color="000000" w:themeColor="text1" w:sz="12"/>
+              </w:rPr>
+            </w:pPr>
+          </w:p>
+        </w:tc>
+        <w:tc>
+          <w:tcPr>
+            <w:tcW w:w="480" w:type="dxa"/>
+            <w:tcBorders>
+              <w:top w:val="nil"/>
+              <w:left w:val="nil"/>
               <w:bottom w:val="nil"/>
               <w:right w:val="nil"/>
             </w:tcBorders>
@@ -7718,6 +7760,7 @@
               <w:bottom w:val="nil"/>
               <w:right w:val="nil"/>
             </w:tcBorders>
+            <w:shd w:val="clear" w:color="auto" w:fill="4C94D8" w:themeFill="text2" w:themeFillTint="80"/>
             <w:tcMar>
               <w:top w:w="45" w:type="dxa"/>
               <w:left w:w="60" w:type="dxa"/>
@@ -7744,46 +7787,14 @@
         </w:tc>
         <w:tc>
           <w:tcPr>
-            <w:tcW w:w="490" w:type="dxa"/>
-            <w:tcBorders>
-              <w:top w:val="nil"/>
-              <w:left w:val="nil"/>
-              <w:bottom w:val="nil"/>
-              <w:right w:val="nil"/>
-            </w:tcBorders>
-            <w:tcMar>
-              <w:top w:w="45" w:type="dxa"/>
-              <w:left w:w="60" w:type="dxa"/>
-              <w:bottom w:w="45" w:type="dxa"/>
-              <w:right w:w="60" w:type="dxa"/>
-            </w:tcMar>
-            <w:vAlign w:val="top"/>
-          </w:tcPr>
-          <w:p>
-            <w:pPr>
-              <w:spacing w:before="0" w:after="0"/>
-              <w:jc w:val="center"/>
-              <w:rPr>
-                <w:rFonts w:ascii="Arial" w:hAnsi="Arial" w:eastAsia="Arial" w:cs="Arial"/>
-                <w:b w:val="0"/>
-                <w:bCs w:val="0"/>
-                <w:i w:val="0"/>
-                <w:iCs w:val="0"/>
-                <w:sz w:val="18"/>
-                <w:szCs w:val="18"/>
-              </w:rPr>
-            </w:pPr>
-          </w:p>
-        </w:tc>
-        <w:tc>
-          <w:tcPr>
-            <w:tcW w:w="490" w:type="dxa"/>
-            <w:tcBorders>
-              <w:top w:val="nil"/>
-              <w:left w:val="nil"/>
-              <w:bottom w:val="nil"/>
-              <w:right w:val="nil"/>
-            </w:tcBorders>
+            <w:tcW w:w="499" w:type="dxa"/>
+            <w:tcBorders>
+              <w:top w:val="nil"/>
+              <w:left w:val="nil"/>
+              <w:bottom w:val="nil"/>
+              <w:right w:val="nil"/>
+            </w:tcBorders>
+            <w:shd w:val="clear" w:color="auto" w:fill="4C94D8" w:themeFill="text2" w:themeFillTint="80"/>
             <w:tcMar>
               <w:top w:w="45" w:type="dxa"/>
               <w:left w:w="60" w:type="dxa"/>
@@ -7817,6 +7828,7 @@
               <w:bottom w:val="nil"/>
               <w:right w:val="nil"/>
             </w:tcBorders>
+            <w:shd w:val="clear" w:color="auto" w:fill="4C94D8" w:themeFill="text2" w:themeFillTint="80"/>
             <w:tcMar>
               <w:top w:w="45" w:type="dxa"/>
               <w:left w:w="60" w:type="dxa"/>
@@ -7850,6 +7862,7 @@
               <w:bottom w:val="nil"/>
               <w:right w:val="nil"/>
             </w:tcBorders>
+            <w:shd w:val="clear" w:color="auto" w:fill="4C94D8" w:themeFill="text2" w:themeFillTint="80"/>
             <w:tcMar>
               <w:top w:w="45" w:type="dxa"/>
               <w:left w:w="60" w:type="dxa"/>
@@ -8116,10 +8129,10 @@
           <w:tcPr>
             <w:tcW w:w="245" w:type="dxa"/>
             <w:tcBorders>
-              <w:top w:val="single" w:color="BFBFBF" w:themeColor="background1" w:themeShade="BF" w:sz="6"/>
-              <w:left w:val="single" w:color="BFBFBF" w:themeColor="background1" w:themeShade="BF" w:sz="6"/>
-              <w:bottom w:val="single" w:color="BFBFBF" w:themeColor="background1" w:themeShade="BF" w:sz="6"/>
-              <w:right w:val="single" w:color="BFBFBF" w:themeColor="background1" w:themeShade="BF" w:sz="6"/>
+              <w:top w:val="single" w:color="BFBFBF" w:themeColor="background1" w:themeShade="BF" w:sz="2"/>
+              <w:left w:val="single" w:color="BFBFBF" w:themeColor="background1" w:themeShade="BF" w:sz="2"/>
+              <w:bottom w:val="single" w:color="BFBFBF" w:themeColor="background1" w:themeShade="BF" w:sz="2"/>
+              <w:right w:val="single" w:color="BFBFBF" w:themeColor="background1" w:themeShade="BF" w:sz="2"/>
             </w:tcBorders>
             <w:tcMar>
               <w:top w:w="45" w:type="dxa"/>
@@ -8162,42 +8175,42 @@
           <w:tcPr>
             <w:tcW w:w="2204" w:type="dxa"/>
             <w:tcBorders>
-              <w:top w:val="single" w:color="BFBFBF" w:themeColor="background1" w:themeShade="BF" w:sz="6"/>
-              <w:left w:val="single" w:color="BFBFBF" w:themeColor="background1" w:themeShade="BF" w:sz="6"/>
-              <w:bottom w:val="single" w:color="BFBFBF" w:themeColor="background1" w:themeShade="BF" w:sz="6"/>
-              <w:right w:val="single" w:color="000000" w:themeColor="text1" w:sz="12"/>
-            </w:tcBorders>
-            <w:tcMar>
-              <w:top w:w="45" w:type="dxa"/>
-              <w:left w:w="60" w:type="dxa"/>
-              <w:bottom w:w="45" w:type="dxa"/>
-              <w:right w:w="60" w:type="dxa"/>
-            </w:tcMar>
-            <w:vAlign w:val="top"/>
-          </w:tcPr>
-          <w:p>
-            <w:pPr>
-              <w:spacing w:before="0" w:after="0"/>
-              <w:jc w:val="center"/>
-              <w:rPr>
-                <w:rFonts w:ascii="Arial" w:hAnsi="Arial" w:eastAsia="Arial" w:cs="Arial"/>
-                <w:b w:val="0"/>
-                <w:bCs w:val="0"/>
-                <w:i w:val="0"/>
-                <w:iCs w:val="0"/>
-                <w:sz w:val="20"/>
-                <w:szCs w:val="20"/>
+              <w:top w:val="single" w:color="BFBFBF" w:themeColor="background1" w:themeShade="BF" w:sz="2"/>
+              <w:left w:val="single" w:color="BFBFBF" w:themeColor="background1" w:themeShade="BF" w:sz="2"/>
+              <w:bottom w:val="single" w:color="BFBFBF" w:themeColor="background1" w:themeShade="BF" w:sz="2"/>
+              <w:right w:val="single" w:color="000000" w:themeColor="text1" w:sz="2"/>
+            </w:tcBorders>
+            <w:tcMar>
+              <w:top w:w="45" w:type="dxa"/>
+              <w:left w:w="60" w:type="dxa"/>
+              <w:bottom w:w="45" w:type="dxa"/>
+              <w:right w:w="60" w:type="dxa"/>
+            </w:tcMar>
+            <w:vAlign w:val="top"/>
+          </w:tcPr>
+          <w:p>
+            <w:pPr>
+              <w:spacing w:before="0" w:after="0"/>
+              <w:jc w:val="left"/>
+              <w:rPr>
+                <w:rFonts w:ascii="Arial" w:hAnsi="Arial" w:eastAsia="Arial" w:cs="Arial"/>
+                <w:b w:val="0"/>
+                <w:bCs w:val="0"/>
+                <w:i w:val="0"/>
+                <w:iCs w:val="0"/>
+                <w:sz w:val="18"/>
+                <w:szCs w:val="18"/>
               </w:rPr>
             </w:pPr>
             <w:r>
               <w:rPr>
                 <w:rFonts w:ascii="Arial" w:hAnsi="Arial" w:eastAsia="Arial" w:cs="Arial"/>
-                <w:b w:val="1"/>
-                <w:bCs w:val="1"/>
-                <w:i w:val="0"/>
-                <w:iCs w:val="0"/>
-                <w:sz w:val="20"/>
-                <w:szCs w:val="20"/>
+                <w:b w:val="0"/>
+                <w:bCs w:val="0"/>
+                <w:i w:val="0"/>
+                <w:iCs w:val="0"/>
+                <w:sz w:val="18"/>
+                <w:szCs w:val="18"/>
                 <w:lang w:val="en-IE"/>
               </w:rPr>
               <w:t>Validation</w:t>
@@ -8213,8 +8226,8 @@
                 <w:bCs w:val="0"/>
                 <w:i w:val="0"/>
                 <w:iCs w:val="0"/>
-                <w:sz w:val="17"/>
-                <w:szCs w:val="17"/>
+                <w:sz w:val="18"/>
+                <w:szCs w:val="18"/>
               </w:rPr>
             </w:pPr>
             <w:r>
@@ -8224,8 +8237,8 @@
                 <w:bCs w:val="0"/>
                 <w:i w:val="0"/>
                 <w:iCs w:val="0"/>
-                <w:sz w:val="17"/>
-                <w:szCs w:val="17"/>
+                <w:sz w:val="18"/>
+                <w:szCs w:val="18"/>
                 <w:lang w:val="en-IE"/>
               </w:rPr>
               <w:t>MAE, RMSE, back-test</w:t>
@@ -8237,7 +8250,7 @@
             <w:tcW w:w="500" w:type="dxa"/>
             <w:tcBorders>
               <w:top w:val="nil"/>
-              <w:left w:val="single" w:color="000000" w:themeColor="text1" w:sz="12"/>
+              <w:left w:val="single" w:color="000000" w:themeColor="text1" w:sz="2"/>
               <w:bottom w:val="nil"/>
               <w:right w:val="nil"/>
             </w:tcBorders>
@@ -8267,7 +8280,7 @@
         </w:tc>
         <w:tc>
           <w:tcPr>
-            <w:tcW w:w="490" w:type="dxa"/>
+            <w:tcW w:w="480" w:type="dxa"/>
             <w:tcBorders>
               <w:top w:val="nil"/>
               <w:left w:val="nil"/>
@@ -8333,13 +8346,14 @@
         </w:tc>
         <w:tc>
           <w:tcPr>
-            <w:tcW w:w="490" w:type="dxa"/>
-            <w:tcBorders>
-              <w:top w:val="nil"/>
-              <w:left w:val="nil"/>
-              <w:bottom w:val="nil"/>
-              <w:right w:val="nil"/>
-            </w:tcBorders>
+            <w:tcW w:w="499" w:type="dxa"/>
+            <w:tcBorders>
+              <w:top w:val="nil"/>
+              <w:left w:val="nil"/>
+              <w:bottom w:val="nil"/>
+              <w:right w:val="nil"/>
+            </w:tcBorders>
+            <w:shd w:val="clear" w:color="auto" w:fill="4C94D8" w:themeFill="text2" w:themeFillTint="80"/>
             <w:tcMar>
               <w:top w:w="45" w:type="dxa"/>
               <w:left w:w="60" w:type="dxa"/>
@@ -8373,6 +8387,7 @@
               <w:bottom w:val="nil"/>
               <w:right w:val="nil"/>
             </w:tcBorders>
+            <w:shd w:val="clear" w:color="auto" w:fill="4C94D8" w:themeFill="text2" w:themeFillTint="80"/>
             <w:tcMar>
               <w:top w:w="45" w:type="dxa"/>
               <w:left w:w="60" w:type="dxa"/>
@@ -8406,6 +8421,7 @@
               <w:bottom w:val="nil"/>
               <w:right w:val="nil"/>
             </w:tcBorders>
+            <w:shd w:val="clear" w:color="auto" w:fill="4C94D8" w:themeFill="text2" w:themeFillTint="80"/>
             <w:tcMar>
               <w:top w:w="45" w:type="dxa"/>
               <w:left w:w="60" w:type="dxa"/>
@@ -8439,6 +8455,7 @@
               <w:bottom w:val="nil"/>
               <w:right w:val="nil"/>
             </w:tcBorders>
+            <w:shd w:val="clear" w:color="auto" w:fill="4C94D8" w:themeFill="text2" w:themeFillTint="80"/>
             <w:tcMar>
               <w:top w:w="45" w:type="dxa"/>
               <w:left w:w="60" w:type="dxa"/>
@@ -8671,10 +8688,10 @@
           <w:tcPr>
             <w:tcW w:w="245" w:type="dxa"/>
             <w:tcBorders>
-              <w:top w:val="single" w:color="BFBFBF" w:themeColor="background1" w:themeShade="BF" w:sz="6"/>
-              <w:left w:val="single" w:color="BFBFBF" w:themeColor="background1" w:themeShade="BF" w:sz="6"/>
-              <w:bottom w:val="single" w:color="BFBFBF" w:themeColor="background1" w:themeShade="BF" w:sz="6"/>
-              <w:right w:val="single" w:color="BFBFBF" w:themeColor="background1" w:themeShade="BF" w:sz="6"/>
+              <w:top w:val="single" w:color="BFBFBF" w:themeColor="background1" w:themeShade="BF" w:sz="2"/>
+              <w:left w:val="single" w:color="BFBFBF" w:themeColor="background1" w:themeShade="BF" w:sz="2"/>
+              <w:bottom w:val="single" w:color="BFBFBF" w:themeColor="background1" w:themeShade="BF" w:sz="2"/>
+              <w:right w:val="single" w:color="BFBFBF" w:themeColor="background1" w:themeShade="BF" w:sz="2"/>
             </w:tcBorders>
             <w:tcMar>
               <w:top w:w="45" w:type="dxa"/>
@@ -8717,97 +8734,23 @@
           <w:tcPr>
             <w:tcW w:w="2204" w:type="dxa"/>
             <w:tcBorders>
-              <w:top w:val="single" w:color="BFBFBF" w:themeColor="background1" w:themeShade="BF" w:sz="6"/>
-              <w:left w:val="single" w:color="BFBFBF" w:themeColor="background1" w:themeShade="BF" w:sz="6"/>
-              <w:bottom w:val="single" w:color="BFBFBF" w:themeColor="background1" w:themeShade="BF" w:sz="6"/>
-              <w:right w:val="single" w:color="000000" w:themeColor="text1" w:sz="12"/>
-            </w:tcBorders>
-            <w:tcMar>
-              <w:top w:w="45" w:type="dxa"/>
-              <w:left w:w="60" w:type="dxa"/>
-              <w:bottom w:w="45" w:type="dxa"/>
-              <w:right w:w="60" w:type="dxa"/>
-            </w:tcMar>
-            <w:vAlign w:val="top"/>
-          </w:tcPr>
-          <w:p>
-            <w:pPr>
-              <w:spacing w:before="0" w:after="0"/>
-              <w:jc w:val="center"/>
-              <w:rPr>
-                <w:rFonts w:ascii="Arial" w:hAnsi="Arial" w:eastAsia="Arial" w:cs="Arial"/>
-                <w:b w:val="0"/>
-                <w:bCs w:val="0"/>
-                <w:i w:val="0"/>
-                <w:iCs w:val="0"/>
-                <w:sz w:val="20"/>
-                <w:szCs w:val="20"/>
-              </w:rPr>
-            </w:pPr>
-            <w:r>
-              <w:rPr>
-                <w:rFonts w:ascii="Arial" w:hAnsi="Arial" w:eastAsia="Arial" w:cs="Arial"/>
-                <w:b w:val="1"/>
-                <w:bCs w:val="1"/>
-                <w:i w:val="0"/>
-                <w:iCs w:val="0"/>
-                <w:sz w:val="20"/>
-                <w:szCs w:val="20"/>
-                <w:lang w:val="en-IE"/>
-              </w:rPr>
-              <w:t>Selected model</w:t>
-            </w:r>
-          </w:p>
-          <w:p>
-            <w:pPr>
-              <w:spacing w:before="0" w:after="0"/>
-              <w:jc w:val="left"/>
-              <w:rPr>
-                <w:rFonts w:ascii="Arial" w:hAnsi="Arial" w:eastAsia="Arial" w:cs="Arial"/>
-                <w:b w:val="0"/>
-                <w:bCs w:val="0"/>
-                <w:i w:val="0"/>
-                <w:iCs w:val="0"/>
-                <w:sz w:val="17"/>
-                <w:szCs w:val="17"/>
-              </w:rPr>
-            </w:pPr>
-            <w:r>
-              <w:rPr>
-                <w:rFonts w:ascii="Arial" w:hAnsi="Arial" w:eastAsia="Arial" w:cs="Arial"/>
-                <w:b w:val="0"/>
-                <w:bCs w:val="0"/>
-                <w:i w:val="0"/>
-                <w:iCs w:val="0"/>
-                <w:sz w:val="17"/>
-                <w:szCs w:val="17"/>
-                <w:lang w:val="en-IE"/>
-              </w:rPr>
-              <w:t>Tuned and saved</w:t>
-            </w:r>
-          </w:p>
-        </w:tc>
-        <w:tc>
-          <w:tcPr>
-            <w:tcW w:w="500" w:type="dxa"/>
-            <w:tcBorders>
-              <w:top w:val="nil"/>
-              <w:left w:val="single" w:color="000000" w:themeColor="text1" w:sz="12"/>
-              <w:bottom w:val="nil"/>
-              <w:right w:val="nil"/>
-            </w:tcBorders>
-            <w:tcMar>
-              <w:top w:w="45" w:type="dxa"/>
-              <w:left w:w="60" w:type="dxa"/>
-              <w:bottom w:w="45" w:type="dxa"/>
-              <w:right w:w="60" w:type="dxa"/>
-            </w:tcMar>
-            <w:vAlign w:val="top"/>
-          </w:tcPr>
-          <w:p>
-            <w:pPr>
-              <w:spacing w:before="0" w:after="0"/>
-              <w:jc w:val="center"/>
+              <w:top w:val="single" w:color="BFBFBF" w:themeColor="background1" w:themeShade="BF" w:sz="2"/>
+              <w:left w:val="single" w:color="BFBFBF" w:themeColor="background1" w:themeShade="BF" w:sz="2"/>
+              <w:bottom w:val="single" w:color="BFBFBF" w:themeColor="background1" w:themeShade="BF" w:sz="2"/>
+              <w:right w:val="single" w:color="000000" w:themeColor="text1" w:sz="2"/>
+            </w:tcBorders>
+            <w:tcMar>
+              <w:top w:w="45" w:type="dxa"/>
+              <w:left w:w="60" w:type="dxa"/>
+              <w:bottom w:w="45" w:type="dxa"/>
+              <w:right w:w="60" w:type="dxa"/>
+            </w:tcMar>
+            <w:vAlign w:val="top"/>
+          </w:tcPr>
+          <w:p>
+            <w:pPr>
+              <w:spacing w:before="0" w:after="0"/>
+              <w:jc w:val="left"/>
               <w:rPr>
                 <w:rFonts w:ascii="Arial" w:hAnsi="Arial" w:eastAsia="Arial" w:cs="Arial"/>
                 <w:b w:val="0"/>
@@ -8818,29 +8761,7 @@
                 <w:szCs w:val="18"/>
               </w:rPr>
             </w:pPr>
-          </w:p>
-        </w:tc>
-        <w:tc>
-          <w:tcPr>
-            <w:tcW w:w="490" w:type="dxa"/>
-            <w:tcBorders>
-              <w:top w:val="nil"/>
-              <w:left w:val="nil"/>
-              <w:bottom w:val="nil"/>
-              <w:right w:val="nil"/>
-            </w:tcBorders>
-            <w:tcMar>
-              <w:top w:w="45" w:type="dxa"/>
-              <w:left w:w="60" w:type="dxa"/>
-              <w:bottom w:w="45" w:type="dxa"/>
-              <w:right w:w="60" w:type="dxa"/>
-            </w:tcMar>
-            <w:vAlign w:val="top"/>
-          </w:tcPr>
-          <w:p>
-            <w:pPr>
-              <w:spacing w:before="0" w:after="0"/>
-              <w:jc w:val="center"/>
+            <w:r>
               <w:rPr>
                 <w:rFonts w:ascii="Arial" w:hAnsi="Arial" w:eastAsia="Arial" w:cs="Arial"/>
                 <w:b w:val="0"/>
@@ -8849,31 +8770,11 @@
                 <w:iCs w:val="0"/>
                 <w:sz w:val="18"/>
                 <w:szCs w:val="18"/>
-              </w:rPr>
-            </w:pPr>
-          </w:p>
-        </w:tc>
-        <w:tc>
-          <w:tcPr>
-            <w:tcW w:w="490" w:type="dxa"/>
-            <w:tcBorders>
-              <w:top w:val="nil"/>
-              <w:left w:val="nil"/>
-              <w:bottom w:val="nil"/>
-              <w:right w:val="nil"/>
-            </w:tcBorders>
-            <w:tcMar>
-              <w:top w:w="45" w:type="dxa"/>
-              <w:left w:w="60" w:type="dxa"/>
-              <w:bottom w:w="45" w:type="dxa"/>
-              <w:right w:w="60" w:type="dxa"/>
-            </w:tcMar>
-            <w:vAlign w:val="top"/>
-          </w:tcPr>
-          <w:p>
-            <w:pPr>
-              <w:spacing w:before="0" w:after="0"/>
-              <w:jc w:val="center"/>
+                <w:lang w:val="en-IE"/>
+              </w:rPr>
+              <w:t xml:space="preserve">Selected </w:t>
+            </w:r>
+            <w:r>
               <w:rPr>
                 <w:rFonts w:ascii="Arial" w:hAnsi="Arial" w:eastAsia="Arial" w:cs="Arial"/>
                 <w:b w:val="0"/>
@@ -8882,6 +8783,87 @@
                 <w:iCs w:val="0"/>
                 <w:sz w:val="18"/>
                 <w:szCs w:val="18"/>
+                <w:lang w:val="en-IE"/>
+              </w:rPr>
+              <w:t>model, Tuned</w:t>
+            </w:r>
+            <w:r>
+              <w:rPr>
+                <w:rFonts w:ascii="Arial" w:hAnsi="Arial" w:eastAsia="Arial" w:cs="Arial"/>
+                <w:b w:val="0"/>
+                <w:bCs w:val="0"/>
+                <w:i w:val="0"/>
+                <w:iCs w:val="0"/>
+                <w:sz w:val="18"/>
+                <w:szCs w:val="18"/>
+                <w:lang w:val="en-IE"/>
+              </w:rPr>
+              <w:t xml:space="preserve"> and saved</w:t>
+            </w:r>
+          </w:p>
+        </w:tc>
+        <w:tc>
+          <w:tcPr>
+            <w:tcW w:w="500" w:type="dxa"/>
+            <w:tcBorders>
+              <w:top w:val="nil"/>
+              <w:left w:val="single" w:color="000000" w:themeColor="text1" w:sz="2"/>
+              <w:bottom w:val="nil"/>
+              <w:right w:val="nil"/>
+            </w:tcBorders>
+            <w:tcMar>
+              <w:top w:w="45" w:type="dxa"/>
+              <w:left w:w="60" w:type="dxa"/>
+              <w:bottom w:w="45" w:type="dxa"/>
+              <w:right w:w="60" w:type="dxa"/>
+            </w:tcMar>
+            <w:vAlign w:val="top"/>
+          </w:tcPr>
+          <w:p>
+            <w:pPr>
+              <w:spacing w:before="0" w:after="0"/>
+              <w:jc w:val="center"/>
+              <w:rPr>
+                <w:rFonts w:ascii="Arial" w:hAnsi="Arial" w:eastAsia="Arial" w:cs="Arial"/>
+                <w:b w:val="0"/>
+                <w:bCs w:val="0"/>
+                <w:i w:val="0"/>
+                <w:iCs w:val="0"/>
+                <w:sz w:val="18"/>
+                <w:szCs w:val="18"/>
+              </w:rPr>
+            </w:pPr>
+          </w:p>
+        </w:tc>
+        <w:tc>
+          <w:tcPr>
+            <w:tcW w:w="480" w:type="dxa"/>
+            <w:tcBorders>
+              <w:top w:val="nil"/>
+              <w:left w:val="nil"/>
+              <w:bottom w:val="nil"/>
+              <w:right w:val="nil"/>
+            </w:tcBorders>
+            <w:tcMar>
+              <w:top w:w="45" w:type="dxa"/>
+              <w:left w:w="60" w:type="dxa"/>
+              <w:bottom w:w="45" w:type="dxa"/>
+              <w:right w:w="60" w:type="dxa"/>
+            </w:tcMar>
+            <w:vAlign w:val="top"/>
+          </w:tcPr>
+          <w:p>
+            <w:pPr>
+              <w:spacing w:before="0" w:after="0"/>
+              <w:jc w:val="center"/>
+              <w:rPr>
+                <w:rFonts w:ascii="Arial" w:hAnsi="Arial" w:eastAsia="Arial" w:cs="Arial"/>
+                <w:b w:val="0"/>
+                <w:bCs w:val="0"/>
+                <w:i w:val="0"/>
+                <w:iCs w:val="0"/>
+                <w:sz w:val="18"/>
+                <w:szCs w:val="18"/>
               </w:rPr>
             </w:pPr>
           </w:p>
@@ -8906,6 +8888,39 @@
           <w:p>
             <w:pPr>
               <w:spacing w:before="0" w:after="0"/>
+              <w:jc w:val="center"/>
+              <w:rPr>
+                <w:rFonts w:ascii="Arial" w:hAnsi="Arial" w:eastAsia="Arial" w:cs="Arial"/>
+                <w:b w:val="0"/>
+                <w:bCs w:val="0"/>
+                <w:i w:val="0"/>
+                <w:iCs w:val="0"/>
+                <w:sz w:val="18"/>
+                <w:szCs w:val="18"/>
+              </w:rPr>
+            </w:pPr>
+          </w:p>
+        </w:tc>
+        <w:tc>
+          <w:tcPr>
+            <w:tcW w:w="499" w:type="dxa"/>
+            <w:tcBorders>
+              <w:top w:val="nil"/>
+              <w:left w:val="nil"/>
+              <w:bottom w:val="nil"/>
+              <w:right w:val="nil"/>
+            </w:tcBorders>
+            <w:tcMar>
+              <w:top w:w="45" w:type="dxa"/>
+              <w:left w:w="60" w:type="dxa"/>
+              <w:bottom w:w="45" w:type="dxa"/>
+              <w:right w:w="60" w:type="dxa"/>
+            </w:tcMar>
+            <w:vAlign w:val="top"/>
+          </w:tcPr>
+          <w:p>
+            <w:pPr>
+              <w:spacing w:before="0" w:after="0"/>
               <w:jc w:val="left"/>
               <w:rPr>
                 <w:rFonts w:ascii="Arial" w:hAnsi="Arial" w:eastAsia="Arial" w:cs="Arial"/>
@@ -8994,6 +9009,7 @@
               <w:bottom w:val="nil"/>
               <w:right w:val="nil"/>
             </w:tcBorders>
+            <w:shd w:val="clear" w:color="auto" w:fill="4C94D8" w:themeFill="text2" w:themeFillTint="80"/>
             <w:tcMar>
               <w:top w:w="45" w:type="dxa"/>
               <w:left w:w="60" w:type="dxa"/>
@@ -9027,6 +9043,7 @@
               <w:bottom w:val="nil"/>
               <w:right w:val="nil"/>
             </w:tcBorders>
+            <w:shd w:val="clear" w:color="auto" w:fill="4C94D8" w:themeFill="text2" w:themeFillTint="80"/>
             <w:tcMar>
               <w:top w:w="45" w:type="dxa"/>
               <w:left w:w="60" w:type="dxa"/>
@@ -9060,6 +9077,7 @@
               <w:bottom w:val="nil"/>
               <w:right w:val="nil"/>
             </w:tcBorders>
+            <w:shd w:val="clear" w:color="auto" w:fill="4C94D8" w:themeFill="text2" w:themeFillTint="80"/>
             <w:tcMar>
               <w:top w:w="45" w:type="dxa"/>
               <w:left w:w="60" w:type="dxa"/>
@@ -9226,10 +9244,10 @@
           <w:tcPr>
             <w:tcW w:w="245" w:type="dxa"/>
             <w:tcBorders>
-              <w:top w:val="single" w:color="BFBFBF" w:themeColor="background1" w:themeShade="BF" w:sz="6"/>
-              <w:left w:val="single" w:color="BFBFBF" w:themeColor="background1" w:themeShade="BF" w:sz="6"/>
-              <w:bottom w:val="single" w:color="BFBFBF" w:themeColor="background1" w:themeShade="BF" w:sz="6"/>
-              <w:right w:val="single" w:color="BFBFBF" w:themeColor="background1" w:themeShade="BF" w:sz="6"/>
+              <w:top w:val="single" w:color="BFBFBF" w:themeColor="background1" w:themeShade="BF" w:sz="2"/>
+              <w:left w:val="single" w:color="BFBFBF" w:themeColor="background1" w:themeShade="BF" w:sz="2"/>
+              <w:bottom w:val="single" w:color="BFBFBF" w:themeColor="background1" w:themeShade="BF" w:sz="2"/>
+              <w:right w:val="single" w:color="BFBFBF" w:themeColor="background1" w:themeShade="BF" w:sz="2"/>
             </w:tcBorders>
             <w:tcMar>
               <w:top w:w="45" w:type="dxa"/>
@@ -9242,6 +9260,8 @@
           <w:p>
             <w:pPr>
               <w:jc w:val="center"/>
+            </w:pPr>
+            <w:r>
               <w:rPr>
                 <w:rFonts w:ascii="Arial" w:hAnsi="Arial" w:eastAsia="Arial" w:cs="Arial"/>
                 <w:b w:val="0"/>
@@ -9252,118 +9272,42 @@
                 <w:szCs w:val="18"/>
                 <w:lang w:val="en-IE"/>
               </w:rPr>
-            </w:pPr>
+              <w:t>11</w:t>
+            </w:r>
           </w:p>
         </w:tc>
         <w:tc>
           <w:tcPr>
             <w:tcW w:w="2204" w:type="dxa"/>
             <w:tcBorders>
-              <w:top w:val="single" w:color="BFBFBF" w:themeColor="background1" w:themeShade="BF" w:sz="6"/>
-              <w:left w:val="single" w:color="BFBFBF" w:themeColor="background1" w:themeShade="BF" w:sz="6"/>
-              <w:bottom w:val="single" w:color="BFBFBF" w:themeColor="background1" w:themeShade="BF" w:sz="6"/>
-              <w:right w:val="single" w:color="000000" w:themeColor="text1" w:sz="12"/>
-            </w:tcBorders>
-            <w:tcMar>
-              <w:top w:w="45" w:type="dxa"/>
-              <w:left w:w="60" w:type="dxa"/>
-              <w:bottom w:w="45" w:type="dxa"/>
-              <w:right w:w="60" w:type="dxa"/>
-            </w:tcMar>
-            <w:vAlign w:val="top"/>
-          </w:tcPr>
-          <w:p>
-            <w:pPr>
-              <w:spacing w:before="0" w:after="0"/>
-              <w:jc w:val="center"/>
-              <w:rPr>
-                <w:rFonts w:ascii="Arial" w:hAnsi="Arial" w:eastAsia="Arial" w:cs="Arial"/>
-                <w:b w:val="0"/>
-                <w:bCs w:val="0"/>
-                <w:i w:val="0"/>
-                <w:iCs w:val="0"/>
-                <w:sz w:val="20"/>
-                <w:szCs w:val="20"/>
+              <w:top w:val="single" w:color="BFBFBF" w:themeColor="background1" w:themeShade="BF" w:sz="2"/>
+              <w:left w:val="single" w:color="BFBFBF" w:themeColor="background1" w:themeShade="BF" w:sz="2"/>
+              <w:bottom w:val="single" w:color="BFBFBF" w:themeColor="background1" w:themeShade="BF" w:sz="2"/>
+              <w:right w:val="single" w:color="000000" w:themeColor="text1" w:sz="2"/>
+            </w:tcBorders>
+            <w:tcMar>
+              <w:top w:w="45" w:type="dxa"/>
+              <w:left w:w="60" w:type="dxa"/>
+              <w:bottom w:w="45" w:type="dxa"/>
+              <w:right w:w="60" w:type="dxa"/>
+            </w:tcMar>
+            <w:vAlign w:val="top"/>
+          </w:tcPr>
+          <w:p>
+            <w:pPr>
+              <w:spacing w:before="0" w:after="0"/>
+              <w:jc w:val="left"/>
+              <w:rPr>
+                <w:rFonts w:ascii="Arial" w:hAnsi="Arial" w:eastAsia="Arial" w:cs="Arial"/>
+                <w:b w:val="0"/>
+                <w:bCs w:val="0"/>
+                <w:i w:val="0"/>
+                <w:iCs w:val="0"/>
+                <w:sz w:val="18"/>
+                <w:szCs w:val="18"/>
               </w:rPr>
             </w:pPr>
             <w:r>
-              <w:rPr>
-                <w:rFonts w:ascii="Arial" w:hAnsi="Arial" w:eastAsia="Arial" w:cs="Arial"/>
-                <w:b w:val="1"/>
-                <w:bCs w:val="1"/>
-                <w:i w:val="0"/>
-                <w:iCs w:val="0"/>
-                <w:sz w:val="20"/>
-                <w:szCs w:val="20"/>
-                <w:lang w:val="en-IE"/>
-              </w:rPr>
-              <w:t>Advanced model</w:t>
-            </w:r>
-          </w:p>
-          <w:p>
-            <w:pPr>
-              <w:spacing w:before="0" w:after="0"/>
-              <w:jc w:val="center"/>
-              <w:rPr>
-                <w:rFonts w:ascii="Arial" w:hAnsi="Arial" w:eastAsia="Arial" w:cs="Arial"/>
-                <w:b w:val="0"/>
-                <w:bCs w:val="0"/>
-                <w:i w:val="0"/>
-                <w:iCs w:val="0"/>
-                <w:sz w:val="17"/>
-                <w:szCs w:val="17"/>
-              </w:rPr>
-            </w:pPr>
-            <w:r>
-              <w:rPr>
-                <w:rFonts w:ascii="Arial" w:hAnsi="Arial" w:eastAsia="Arial" w:cs="Arial"/>
-                <w:b w:val="0"/>
-                <w:bCs w:val="0"/>
-                <w:i w:val="0"/>
-                <w:iCs w:val="0"/>
-                <w:sz w:val="17"/>
-                <w:szCs w:val="17"/>
-                <w:lang w:val="en-IE"/>
-              </w:rPr>
-              <w:t>Boosting, time series</w:t>
-            </w:r>
-          </w:p>
-          <w:p>
-            <w:pPr>
-              <w:jc w:val="center"/>
-              <w:rPr>
-                <w:rFonts w:ascii="Arial" w:hAnsi="Arial" w:eastAsia="Arial" w:cs="Arial"/>
-                <w:b w:val="0"/>
-                <w:bCs w:val="0"/>
-                <w:i w:val="0"/>
-                <w:iCs w:val="0"/>
-                <w:sz w:val="20"/>
-                <w:szCs w:val="20"/>
-                <w:lang w:val="en-IE"/>
-              </w:rPr>
-            </w:pPr>
-          </w:p>
-        </w:tc>
-        <w:tc>
-          <w:tcPr>
-            <w:tcW w:w="500" w:type="dxa"/>
-            <w:tcBorders>
-              <w:top w:val="nil"/>
-              <w:left w:val="single" w:color="000000" w:themeColor="text1" w:sz="12"/>
-              <w:bottom w:val="nil"/>
-              <w:right w:val="nil"/>
-            </w:tcBorders>
-            <w:tcMar>
-              <w:top w:w="45" w:type="dxa"/>
-              <w:left w:w="60" w:type="dxa"/>
-              <w:bottom w:w="45" w:type="dxa"/>
-              <w:right w:w="60" w:type="dxa"/>
-            </w:tcMar>
-            <w:vAlign w:val="top"/>
-          </w:tcPr>
-          <w:p>
-            <w:pPr>
-              <w:jc w:val="center"/>
               <w:rPr>
                 <w:rFonts w:ascii="Arial" w:hAnsi="Arial" w:eastAsia="Arial" w:cs="Arial"/>
                 <w:b w:val="0"/>
@@ -9374,29 +9318,24 @@
                 <w:szCs w:val="18"/>
                 <w:lang w:val="en-IE"/>
               </w:rPr>
-            </w:pPr>
-          </w:p>
-        </w:tc>
-        <w:tc>
-          <w:tcPr>
-            <w:tcW w:w="490" w:type="dxa"/>
-            <w:tcBorders>
-              <w:top w:val="nil"/>
-              <w:left w:val="nil"/>
-              <w:bottom w:val="nil"/>
-              <w:right w:val="nil"/>
-            </w:tcBorders>
-            <w:tcMar>
-              <w:top w:w="45" w:type="dxa"/>
-              <w:left w:w="60" w:type="dxa"/>
-              <w:bottom w:w="45" w:type="dxa"/>
-              <w:right w:w="60" w:type="dxa"/>
-            </w:tcMar>
-            <w:vAlign w:val="top"/>
-          </w:tcPr>
-          <w:p>
-            <w:pPr>
-              <w:jc w:val="center"/>
+              <w:t>Advanced model</w:t>
+            </w:r>
+          </w:p>
+          <w:p>
+            <w:pPr>
+              <w:spacing w:before="0" w:after="0"/>
+              <w:jc w:val="left"/>
+              <w:rPr>
+                <w:rFonts w:ascii="Arial" w:hAnsi="Arial" w:eastAsia="Arial" w:cs="Arial"/>
+                <w:b w:val="0"/>
+                <w:bCs w:val="0"/>
+                <w:i w:val="0"/>
+                <w:iCs w:val="0"/>
+                <w:sz w:val="17"/>
+                <w:szCs w:val="17"/>
+              </w:rPr>
+            </w:pPr>
+            <w:r>
               <w:rPr>
                 <w:rFonts w:ascii="Arial" w:hAnsi="Arial" w:eastAsia="Arial" w:cs="Arial"/>
                 <w:b w:val="0"/>
@@ -9407,15 +9346,16 @@
                 <w:szCs w:val="18"/>
                 <w:lang w:val="en-IE"/>
               </w:rPr>
-            </w:pPr>
-          </w:p>
-        </w:tc>
-        <w:tc>
-          <w:tcPr>
-            <w:tcW w:w="490" w:type="dxa"/>
-            <w:tcBorders>
-              <w:top w:val="nil"/>
-              <w:left w:val="nil"/>
+              <w:t>Boosting, time series</w:t>
+            </w:r>
+          </w:p>
+        </w:tc>
+        <w:tc>
+          <w:tcPr>
+            <w:tcW w:w="500" w:type="dxa"/>
+            <w:tcBorders>
+              <w:top w:val="nil"/>
+              <w:left w:val="single" w:color="000000" w:themeColor="text1" w:sz="2"/>
               <w:bottom w:val="nil"/>
               <w:right w:val="nil"/>
             </w:tcBorders>
@@ -9445,6 +9385,39 @@
         </w:tc>
         <w:tc>
           <w:tcPr>
+            <w:tcW w:w="480" w:type="dxa"/>
+            <w:tcBorders>
+              <w:top w:val="nil"/>
+              <w:left w:val="nil"/>
+              <w:bottom w:val="nil"/>
+              <w:right w:val="nil"/>
+            </w:tcBorders>
+            <w:tcMar>
+              <w:top w:w="45" w:type="dxa"/>
+              <w:left w:w="60" w:type="dxa"/>
+              <w:bottom w:w="45" w:type="dxa"/>
+              <w:right w:w="60" w:type="dxa"/>
+            </w:tcMar>
+            <w:vAlign w:val="top"/>
+          </w:tcPr>
+          <w:p>
+            <w:pPr>
+              <w:jc w:val="center"/>
+              <w:rPr>
+                <w:rFonts w:ascii="Arial" w:hAnsi="Arial" w:eastAsia="Arial" w:cs="Arial"/>
+                <w:b w:val="0"/>
+                <w:bCs w:val="0"/>
+                <w:i w:val="0"/>
+                <w:iCs w:val="0"/>
+                <w:sz w:val="18"/>
+                <w:szCs w:val="18"/>
+                <w:lang w:val="en-IE"/>
+              </w:rPr>
+            </w:pPr>
+          </w:p>
+        </w:tc>
+        <w:tc>
+          <w:tcPr>
             <w:tcW w:w="490" w:type="dxa"/>
             <w:tcBorders>
               <w:top w:val="nil"/>
@@ -9462,15 +9435,15 @@
           </w:tcPr>
           <w:p>
             <w:pPr>
-              <w:jc w:val="left"/>
-              <w:rPr>
-                <w:rFonts w:ascii="Arial" w:hAnsi="Arial" w:eastAsia="Arial" w:cs="Arial"/>
-                <w:b w:val="0"/>
-                <w:bCs w:val="0"/>
-                <w:i w:val="0"/>
-                <w:iCs w:val="0"/>
-                <w:sz w:val="20"/>
-                <w:szCs w:val="20"/>
+              <w:jc w:val="center"/>
+              <w:rPr>
+                <w:rFonts w:ascii="Arial" w:hAnsi="Arial" w:eastAsia="Arial" w:cs="Arial"/>
+                <w:b w:val="0"/>
+                <w:bCs w:val="0"/>
+                <w:i w:val="0"/>
+                <w:iCs w:val="0"/>
+                <w:sz w:val="18"/>
+                <w:szCs w:val="18"/>
                 <w:lang w:val="en-IE"/>
               </w:rPr>
             </w:pPr>
@@ -9478,6 +9451,39 @@
         </w:tc>
         <w:tc>
           <w:tcPr>
+            <w:tcW w:w="499" w:type="dxa"/>
+            <w:tcBorders>
+              <w:top w:val="nil"/>
+              <w:left w:val="nil"/>
+              <w:bottom w:val="nil"/>
+              <w:right w:val="nil"/>
+            </w:tcBorders>
+            <w:tcMar>
+              <w:top w:w="45" w:type="dxa"/>
+              <w:left w:w="60" w:type="dxa"/>
+              <w:bottom w:w="45" w:type="dxa"/>
+              <w:right w:w="60" w:type="dxa"/>
+            </w:tcMar>
+            <w:vAlign w:val="top"/>
+          </w:tcPr>
+          <w:p>
+            <w:pPr>
+              <w:jc w:val="left"/>
+              <w:rPr>
+                <w:rFonts w:ascii="Arial" w:hAnsi="Arial" w:eastAsia="Arial" w:cs="Arial"/>
+                <w:b w:val="0"/>
+                <w:bCs w:val="0"/>
+                <w:i w:val="0"/>
+                <w:iCs w:val="0"/>
+                <w:sz w:val="20"/>
+                <w:szCs w:val="20"/>
+                <w:lang w:val="en-IE"/>
+              </w:rPr>
+            </w:pPr>
+          </w:p>
+        </w:tc>
+        <w:tc>
+          <w:tcPr>
             <w:tcW w:w="505" w:type="dxa"/>
             <w:tcBorders>
               <w:top w:val="nil"/>
@@ -9584,6 +9590,7 @@
               <w:bottom w:val="nil"/>
               <w:right w:val="nil"/>
             </w:tcBorders>
+            <w:shd w:val="clear" w:color="auto" w:fill="4C94D8" w:themeFill="text2" w:themeFillTint="80"/>
             <w:tcMar>
               <w:top w:w="45" w:type="dxa"/>
               <w:left w:w="60" w:type="dxa"/>
@@ -9617,6 +9624,7 @@
               <w:bottom w:val="nil"/>
               <w:right w:val="nil"/>
             </w:tcBorders>
+            <w:shd w:val="clear" w:color="auto" w:fill="4C94D8" w:themeFill="text2" w:themeFillTint="80"/>
             <w:tcMar>
               <w:top w:w="45" w:type="dxa"/>
               <w:left w:w="60" w:type="dxa"/>
@@ -9783,10 +9791,10 @@
           <w:tcPr>
             <w:tcW w:w="245" w:type="dxa"/>
             <w:tcBorders>
-              <w:top w:val="single" w:color="BFBFBF" w:themeColor="background1" w:themeShade="BF" w:sz="6"/>
-              <w:left w:val="single" w:color="BFBFBF" w:themeColor="background1" w:themeShade="BF" w:sz="6"/>
-              <w:bottom w:val="single" w:color="BFBFBF" w:themeColor="background1" w:themeShade="BF" w:sz="6"/>
-              <w:right w:val="single" w:color="BFBFBF" w:themeColor="background1" w:themeShade="BF" w:sz="6"/>
+              <w:top w:val="single" w:color="BFBFBF" w:themeColor="background1" w:themeShade="BF" w:sz="2"/>
+              <w:left w:val="single" w:color="BFBFBF" w:themeColor="background1" w:themeShade="BF" w:sz="2"/>
+              <w:bottom w:val="single" w:color="BFBFBF" w:themeColor="background1" w:themeShade="BF" w:sz="2"/>
+              <w:right w:val="single" w:color="BFBFBF" w:themeColor="background1" w:themeShade="BF" w:sz="2"/>
             </w:tcBorders>
             <w:tcMar>
               <w:top w:w="45" w:type="dxa"/>
@@ -9799,6 +9807,8 @@
           <w:p>
             <w:pPr>
               <w:jc w:val="center"/>
+            </w:pPr>
+            <w:r>
               <w:rPr>
                 <w:rFonts w:ascii="Arial" w:hAnsi="Arial" w:eastAsia="Arial" w:cs="Arial"/>
                 <w:b w:val="0"/>
@@ -9809,102 +9819,42 @@
                 <w:szCs w:val="18"/>
                 <w:lang w:val="en-IE"/>
               </w:rPr>
-            </w:pPr>
+              <w:t>12</w:t>
+            </w:r>
           </w:p>
         </w:tc>
         <w:tc>
           <w:tcPr>
             <w:tcW w:w="2204" w:type="dxa"/>
             <w:tcBorders>
-              <w:top w:val="single" w:color="BFBFBF" w:themeColor="background1" w:themeShade="BF" w:sz="6"/>
-              <w:left w:val="single" w:color="BFBFBF" w:themeColor="background1" w:themeShade="BF" w:sz="6"/>
-              <w:bottom w:val="single" w:color="BFBFBF" w:themeColor="background1" w:themeShade="BF" w:sz="6"/>
-              <w:right w:val="single" w:color="000000" w:themeColor="text1" w:sz="12"/>
-            </w:tcBorders>
-            <w:tcMar>
-              <w:top w:w="45" w:type="dxa"/>
-              <w:left w:w="60" w:type="dxa"/>
-              <w:bottom w:w="45" w:type="dxa"/>
-              <w:right w:w="60" w:type="dxa"/>
-            </w:tcMar>
-            <w:vAlign w:val="top"/>
-          </w:tcPr>
-          <w:p>
-            <w:pPr>
-              <w:spacing w:before="0" w:after="0"/>
-              <w:jc w:val="center"/>
-              <w:rPr>
-                <w:rFonts w:ascii="Arial" w:hAnsi="Arial" w:eastAsia="Arial" w:cs="Arial"/>
-                <w:b w:val="0"/>
-                <w:bCs w:val="0"/>
-                <w:i w:val="0"/>
-                <w:iCs w:val="0"/>
-                <w:sz w:val="20"/>
-                <w:szCs w:val="20"/>
+              <w:top w:val="single" w:color="BFBFBF" w:themeColor="background1" w:themeShade="BF" w:sz="2"/>
+              <w:left w:val="single" w:color="BFBFBF" w:themeColor="background1" w:themeShade="BF" w:sz="2"/>
+              <w:bottom w:val="single" w:color="BFBFBF" w:themeColor="background1" w:themeShade="BF" w:sz="2"/>
+              <w:right w:val="single" w:color="000000" w:themeColor="text1" w:sz="2"/>
+            </w:tcBorders>
+            <w:tcMar>
+              <w:top w:w="45" w:type="dxa"/>
+              <w:left w:w="60" w:type="dxa"/>
+              <w:bottom w:w="45" w:type="dxa"/>
+              <w:right w:w="60" w:type="dxa"/>
+            </w:tcMar>
+            <w:vAlign w:val="top"/>
+          </w:tcPr>
+          <w:p>
+            <w:pPr>
+              <w:spacing w:before="0" w:after="0"/>
+              <w:jc w:val="left"/>
+              <w:rPr>
+                <w:rFonts w:ascii="Arial" w:hAnsi="Arial" w:eastAsia="Arial" w:cs="Arial"/>
+                <w:b w:val="0"/>
+                <w:bCs w:val="0"/>
+                <w:i w:val="0"/>
+                <w:iCs w:val="0"/>
+                <w:sz w:val="18"/>
+                <w:szCs w:val="18"/>
               </w:rPr>
             </w:pPr>
             <w:r>
-              <w:rPr>
-                <w:rFonts w:ascii="Arial" w:hAnsi="Arial" w:eastAsia="Arial" w:cs="Arial"/>
-                <w:b w:val="1"/>
-                <w:bCs w:val="1"/>
-                <w:i w:val="0"/>
-                <w:iCs w:val="0"/>
-                <w:sz w:val="20"/>
-                <w:szCs w:val="20"/>
-                <w:lang w:val="en-IE"/>
-              </w:rPr>
-              <w:t>cenario engine</w:t>
-            </w:r>
-          </w:p>
-          <w:p>
-            <w:pPr>
-              <w:jc w:val="center"/>
-              <w:rPr>
-                <w:rFonts w:ascii="Arial" w:hAnsi="Arial" w:eastAsia="Arial" w:cs="Arial"/>
-                <w:b w:val="0"/>
-                <w:bCs w:val="0"/>
-                <w:i w:val="0"/>
-                <w:iCs w:val="0"/>
-                <w:sz w:val="17"/>
-                <w:szCs w:val="17"/>
-              </w:rPr>
-            </w:pPr>
-            <w:r>
-              <w:rPr>
-                <w:rFonts w:ascii="Arial" w:hAnsi="Arial" w:eastAsia="Arial" w:cs="Arial"/>
-                <w:b w:val="0"/>
-                <w:bCs w:val="0"/>
-                <w:i w:val="0"/>
-                <w:iCs w:val="0"/>
-                <w:sz w:val="17"/>
-                <w:szCs w:val="17"/>
-                <w:lang w:val="en-IE"/>
-              </w:rPr>
-              <w:t>Route, delay, shock</w:t>
-            </w:r>
-          </w:p>
-        </w:tc>
-        <w:tc>
-          <w:tcPr>
-            <w:tcW w:w="500" w:type="dxa"/>
-            <w:tcBorders>
-              <w:top w:val="nil"/>
-              <w:left w:val="single" w:color="000000" w:themeColor="text1" w:sz="12"/>
-              <w:bottom w:val="nil"/>
-              <w:right w:val="nil"/>
-            </w:tcBorders>
-            <w:tcMar>
-              <w:top w:w="45" w:type="dxa"/>
-              <w:left w:w="60" w:type="dxa"/>
-              <w:bottom w:w="45" w:type="dxa"/>
-              <w:right w:w="60" w:type="dxa"/>
-            </w:tcMar>
-            <w:vAlign w:val="top"/>
-          </w:tcPr>
-          <w:p>
-            <w:pPr>
-              <w:jc w:val="center"/>
               <w:rPr>
                 <w:rFonts w:ascii="Arial" w:hAnsi="Arial" w:eastAsia="Arial" w:cs="Arial"/>
                 <w:b w:val="0"/>
@@ -9915,29 +9865,9 @@
                 <w:szCs w:val="18"/>
                 <w:lang w:val="en-IE"/>
               </w:rPr>
-            </w:pPr>
-          </w:p>
-        </w:tc>
-        <w:tc>
-          <w:tcPr>
-            <w:tcW w:w="490" w:type="dxa"/>
-            <w:tcBorders>
-              <w:top w:val="nil"/>
-              <w:left w:val="nil"/>
-              <w:bottom w:val="nil"/>
-              <w:right w:val="nil"/>
-            </w:tcBorders>
-            <w:tcMar>
-              <w:top w:w="45" w:type="dxa"/>
-              <w:left w:w="60" w:type="dxa"/>
-              <w:bottom w:w="45" w:type="dxa"/>
-              <w:right w:w="60" w:type="dxa"/>
-            </w:tcMar>
-            <w:vAlign w:val="top"/>
-          </w:tcPr>
-          <w:p>
-            <w:pPr>
-              <w:jc w:val="center"/>
+              <w:t>scenario</w:t>
+            </w:r>
+            <w:r>
               <w:rPr>
                 <w:rFonts w:ascii="Arial" w:hAnsi="Arial" w:eastAsia="Arial" w:cs="Arial"/>
                 <w:b w:val="0"/>
@@ -9948,29 +9878,23 @@
                 <w:szCs w:val="18"/>
                 <w:lang w:val="en-IE"/>
               </w:rPr>
-            </w:pPr>
-          </w:p>
-        </w:tc>
-        <w:tc>
-          <w:tcPr>
-            <w:tcW w:w="490" w:type="dxa"/>
-            <w:tcBorders>
-              <w:top w:val="nil"/>
-              <w:left w:val="nil"/>
-              <w:bottom w:val="nil"/>
-              <w:right w:val="nil"/>
-            </w:tcBorders>
-            <w:tcMar>
-              <w:top w:w="45" w:type="dxa"/>
-              <w:left w:w="60" w:type="dxa"/>
-              <w:bottom w:w="45" w:type="dxa"/>
-              <w:right w:w="60" w:type="dxa"/>
-            </w:tcMar>
-            <w:vAlign w:val="top"/>
-          </w:tcPr>
-          <w:p>
-            <w:pPr>
-              <w:jc w:val="center"/>
+              <w:t xml:space="preserve"> engine</w:t>
+            </w:r>
+          </w:p>
+          <w:p>
+            <w:pPr>
+              <w:jc w:val="left"/>
+              <w:rPr>
+                <w:rFonts w:ascii="Arial" w:hAnsi="Arial" w:eastAsia="Arial" w:cs="Arial"/>
+                <w:b w:val="0"/>
+                <w:bCs w:val="0"/>
+                <w:i w:val="0"/>
+                <w:iCs w:val="0"/>
+                <w:sz w:val="18"/>
+                <w:szCs w:val="18"/>
+              </w:rPr>
+            </w:pPr>
+            <w:r>
               <w:rPr>
                 <w:rFonts w:ascii="Arial" w:hAnsi="Arial" w:eastAsia="Arial" w:cs="Arial"/>
                 <w:b w:val="0"/>
@@ -9981,6 +9905,73 @@
                 <w:szCs w:val="18"/>
                 <w:lang w:val="en-IE"/>
               </w:rPr>
+              <w:t>Route, delay, shock</w:t>
+            </w:r>
+          </w:p>
+        </w:tc>
+        <w:tc>
+          <w:tcPr>
+            <w:tcW w:w="500" w:type="dxa"/>
+            <w:tcBorders>
+              <w:top w:val="nil"/>
+              <w:left w:val="single" w:color="000000" w:themeColor="text1" w:sz="2"/>
+              <w:bottom w:val="nil"/>
+              <w:right w:val="nil"/>
+            </w:tcBorders>
+            <w:tcMar>
+              <w:top w:w="45" w:type="dxa"/>
+              <w:left w:w="60" w:type="dxa"/>
+              <w:bottom w:w="45" w:type="dxa"/>
+              <w:right w:w="60" w:type="dxa"/>
+            </w:tcMar>
+            <w:vAlign w:val="top"/>
+          </w:tcPr>
+          <w:p>
+            <w:pPr>
+              <w:jc w:val="center"/>
+              <w:rPr>
+                <w:rFonts w:ascii="Arial" w:hAnsi="Arial" w:eastAsia="Arial" w:cs="Arial"/>
+                <w:b w:val="0"/>
+                <w:bCs w:val="0"/>
+                <w:i w:val="0"/>
+                <w:iCs w:val="0"/>
+                <w:sz w:val="18"/>
+                <w:szCs w:val="18"/>
+                <w:lang w:val="en-IE"/>
+              </w:rPr>
+            </w:pPr>
+          </w:p>
+        </w:tc>
+        <w:tc>
+          <w:tcPr>
+            <w:tcW w:w="480" w:type="dxa"/>
+            <w:tcBorders>
+              <w:top w:val="nil"/>
+              <w:left w:val="nil"/>
+              <w:bottom w:val="nil"/>
+              <w:right w:val="nil"/>
+            </w:tcBorders>
+            <w:tcMar>
+              <w:top w:w="45" w:type="dxa"/>
+              <w:left w:w="60" w:type="dxa"/>
+              <w:bottom w:w="45" w:type="dxa"/>
+              <w:right w:w="60" w:type="dxa"/>
+            </w:tcMar>
+            <w:vAlign w:val="top"/>
+          </w:tcPr>
+          <w:p>
+            <w:pPr>
+              <w:jc w:val="center"/>
+              <w:rPr>
+                <w:rFonts w:ascii="Arial" w:hAnsi="Arial" w:eastAsia="Arial" w:cs="Arial"/>
+                <w:b w:val="0"/>
+                <w:bCs w:val="0"/>
+                <w:i w:val="0"/>
+                <w:iCs w:val="0"/>
+                <w:sz w:val="18"/>
+                <w:szCs w:val="18"/>
+                <w:lang w:val="en-IE"/>
+              </w:rPr>
             </w:pPr>
           </w:p>
         </w:tc>
@@ -10003,15 +9994,15 @@
           </w:tcPr>
           <w:p>
             <w:pPr>
-              <w:jc w:val="left"/>
-              <w:rPr>
-                <w:rFonts w:ascii="Arial" w:hAnsi="Arial" w:eastAsia="Arial" w:cs="Arial"/>
-                <w:b w:val="0"/>
-                <w:bCs w:val="0"/>
-                <w:i w:val="0"/>
-                <w:iCs w:val="0"/>
-                <w:sz w:val="20"/>
-                <w:szCs w:val="20"/>
+              <w:jc w:val="center"/>
+              <w:rPr>
+                <w:rFonts w:ascii="Arial" w:hAnsi="Arial" w:eastAsia="Arial" w:cs="Arial"/>
+                <w:b w:val="0"/>
+                <w:bCs w:val="0"/>
+                <w:i w:val="0"/>
+                <w:iCs w:val="0"/>
+                <w:sz w:val="18"/>
+                <w:szCs w:val="18"/>
                 <w:lang w:val="en-IE"/>
               </w:rPr>
             </w:pPr>
@@ -10019,6 +10010,39 @@
         </w:tc>
         <w:tc>
           <w:tcPr>
+            <w:tcW w:w="499" w:type="dxa"/>
+            <w:tcBorders>
+              <w:top w:val="nil"/>
+              <w:left w:val="nil"/>
+              <w:bottom w:val="nil"/>
+              <w:right w:val="nil"/>
+            </w:tcBorders>
+            <w:tcMar>
+              <w:top w:w="45" w:type="dxa"/>
+              <w:left w:w="60" w:type="dxa"/>
+              <w:bottom w:w="45" w:type="dxa"/>
+              <w:right w:w="60" w:type="dxa"/>
+            </w:tcMar>
+            <w:vAlign w:val="top"/>
+          </w:tcPr>
+          <w:p>
+            <w:pPr>
+              <w:jc w:val="left"/>
+              <w:rPr>
+                <w:rFonts w:ascii="Arial" w:hAnsi="Arial" w:eastAsia="Arial" w:cs="Arial"/>
+                <w:b w:val="0"/>
+                <w:bCs w:val="0"/>
+                <w:i w:val="0"/>
+                <w:iCs w:val="0"/>
+                <w:sz w:val="20"/>
+                <w:szCs w:val="20"/>
+                <w:lang w:val="en-IE"/>
+              </w:rPr>
+            </w:pPr>
+          </w:p>
+        </w:tc>
+        <w:tc>
+          <w:tcPr>
             <w:tcW w:w="505" w:type="dxa"/>
             <w:tcBorders>
               <w:top w:val="nil"/>
@@ -10125,6 +10149,7 @@
               <w:bottom w:val="nil"/>
               <w:right w:val="nil"/>
             </w:tcBorders>
+            <w:shd w:val="clear" w:color="auto" w:fill="4C94D8" w:themeFill="text2" w:themeFillTint="80"/>
             <w:tcMar>
               <w:top w:w="45" w:type="dxa"/>
               <w:left w:w="60" w:type="dxa"/>
@@ -10158,6 +10183,7 @@
               <w:bottom w:val="nil"/>
               <w:right w:val="nil"/>
             </w:tcBorders>
+            <w:shd w:val="clear" w:color="auto" w:fill="4C94D8" w:themeFill="text2" w:themeFillTint="80"/>
             <w:tcMar>
               <w:top w:w="45" w:type="dxa"/>
               <w:left w:w="60" w:type="dxa"/>
@@ -10324,10 +10350,10 @@
           <w:tcPr>
             <w:tcW w:w="245" w:type="dxa"/>
             <w:tcBorders>
-              <w:top w:val="single" w:color="BFBFBF" w:themeColor="background1" w:themeShade="BF" w:sz="6"/>
-              <w:left w:val="single" w:color="BFBFBF" w:themeColor="background1" w:themeShade="BF" w:sz="6"/>
-              <w:bottom w:val="single" w:color="BFBFBF" w:themeColor="background1" w:themeShade="BF" w:sz="6"/>
-              <w:right w:val="single" w:color="BFBFBF" w:themeColor="background1" w:themeShade="BF" w:sz="6"/>
+              <w:top w:val="single" w:color="BFBFBF" w:themeColor="background1" w:themeShade="BF" w:sz="2"/>
+              <w:left w:val="single" w:color="BFBFBF" w:themeColor="background1" w:themeShade="BF" w:sz="2"/>
+              <w:bottom w:val="single" w:color="BFBFBF" w:themeColor="background1" w:themeShade="BF" w:sz="2"/>
+              <w:right w:val="single" w:color="BFBFBF" w:themeColor="background1" w:themeShade="BF" w:sz="2"/>
             </w:tcBorders>
             <w:tcMar>
               <w:top w:w="45" w:type="dxa"/>
@@ -10340,6 +10366,8 @@
           <w:p>
             <w:pPr>
               <w:jc w:val="center"/>
+            </w:pPr>
+            <w:r>
               <w:rPr>
                 <w:rFonts w:ascii="Arial" w:hAnsi="Arial" w:eastAsia="Arial" w:cs="Arial"/>
                 <w:b w:val="0"/>
@@ -10350,30 +10378,31 @@
                 <w:szCs w:val="18"/>
                 <w:lang w:val="en-IE"/>
               </w:rPr>
-            </w:pPr>
+              <w:t>13</w:t>
+            </w:r>
           </w:p>
         </w:tc>
         <w:tc>
           <w:tcPr>
             <w:tcW w:w="2204" w:type="dxa"/>
             <w:tcBorders>
-              <w:top w:val="single" w:color="BFBFBF" w:themeColor="background1" w:themeShade="BF" w:sz="6"/>
-              <w:left w:val="single" w:color="BFBFBF" w:themeColor="background1" w:themeShade="BF" w:sz="6"/>
-              <w:bottom w:val="single" w:color="BFBFBF" w:themeColor="background1" w:themeShade="BF" w:sz="6"/>
-              <w:right w:val="single" w:color="000000" w:themeColor="text1" w:sz="12"/>
-            </w:tcBorders>
-            <w:tcMar>
-              <w:top w:w="45" w:type="dxa"/>
-              <w:left w:w="60" w:type="dxa"/>
-              <w:bottom w:w="45" w:type="dxa"/>
-              <w:right w:w="60" w:type="dxa"/>
-            </w:tcMar>
-            <w:vAlign w:val="top"/>
-          </w:tcPr>
-          <w:p>
-            <w:pPr>
-              <w:spacing w:before="0" w:after="0"/>
-              <w:jc w:val="center"/>
+              <w:top w:val="single" w:color="BFBFBF" w:themeColor="background1" w:themeShade="BF" w:sz="2"/>
+              <w:left w:val="single" w:color="BFBFBF" w:themeColor="background1" w:themeShade="BF" w:sz="2"/>
+              <w:bottom w:val="single" w:color="BFBFBF" w:themeColor="background1" w:themeShade="BF" w:sz="2"/>
+              <w:right w:val="single" w:color="000000" w:themeColor="text1" w:sz="2"/>
+            </w:tcBorders>
+            <w:tcMar>
+              <w:top w:w="45" w:type="dxa"/>
+              <w:left w:w="60" w:type="dxa"/>
+              <w:bottom w:w="45" w:type="dxa"/>
+              <w:right w:w="60" w:type="dxa"/>
+            </w:tcMar>
+            <w:vAlign w:val="top"/>
+          </w:tcPr>
+          <w:p>
+            <w:pPr>
+              <w:spacing w:before="0" w:after="0"/>
+              <w:jc w:val="left"/>
               <w:rPr>
                 <w:rFonts w:ascii="Arial" w:hAnsi="Arial" w:eastAsia="Arial" w:cs="Arial"/>
                 <w:b w:val="0"/>
@@ -10387,8 +10416,8 @@
             <w:r>
               <w:rPr>
                 <w:rFonts w:ascii="Arial" w:hAnsi="Arial" w:eastAsia="Arial" w:cs="Arial"/>
-                <w:b w:val="1"/>
-                <w:bCs w:val="1"/>
+                <w:b w:val="0"/>
+                <w:bCs w:val="0"/>
                 <w:i w:val="0"/>
                 <w:iCs w:val="0"/>
                 <w:sz w:val="20"/>
@@ -10400,7 +10429,7 @@
           </w:p>
           <w:p>
             <w:pPr>
-              <w:jc w:val="center"/>
+              <w:jc w:val="left"/>
               <w:rPr>
                 <w:rFonts w:ascii="Arial" w:hAnsi="Arial" w:eastAsia="Arial" w:cs="Arial"/>
                 <w:b w:val="0"/>
@@ -10431,7 +10460,7 @@
             <w:tcW w:w="500" w:type="dxa"/>
             <w:tcBorders>
               <w:top w:val="nil"/>
-              <w:left w:val="single" w:color="000000" w:themeColor="text1" w:sz="12"/>
+              <w:left w:val="single" w:color="000000" w:themeColor="text1" w:sz="2"/>
               <w:bottom w:val="nil"/>
               <w:right w:val="nil"/>
             </w:tcBorders>
@@ -10461,7 +10490,7 @@
         </w:tc>
         <w:tc>
           <w:tcPr>
-            <w:tcW w:w="490" w:type="dxa"/>
+            <w:tcW w:w="480" w:type="dxa"/>
             <w:tcBorders>
               <w:top w:val="nil"/>
               <w:left w:val="nil"/>
@@ -10527,7 +10556,7 @@
         </w:tc>
         <w:tc>
           <w:tcPr>
-            <w:tcW w:w="490" w:type="dxa"/>
+            <w:tcW w:w="499" w:type="dxa"/>
             <w:tcBorders>
               <w:top w:val="nil"/>
               <w:left w:val="nil"/>
@@ -10666,6 +10695,7 @@
               <w:bottom w:val="nil"/>
               <w:right w:val="nil"/>
             </w:tcBorders>
+            <w:shd w:val="clear" w:color="auto" w:fill="4C94D8" w:themeFill="text2" w:themeFillTint="80"/>
             <w:tcMar>
               <w:top w:w="45" w:type="dxa"/>
               <w:left w:w="60" w:type="dxa"/>
@@ -10699,6 +10729,7 @@
               <w:bottom w:val="nil"/>
               <w:right w:val="nil"/>
             </w:tcBorders>
+            <w:shd w:val="clear" w:color="auto" w:fill="4C94D8" w:themeFill="text2" w:themeFillTint="80"/>
             <w:tcMar>
               <w:top w:w="45" w:type="dxa"/>
               <w:left w:w="60" w:type="dxa"/>
@@ -10865,10 +10896,10 @@
           <w:tcPr>
             <w:tcW w:w="245" w:type="dxa"/>
             <w:tcBorders>
-              <w:top w:val="single" w:color="BFBFBF" w:themeColor="background1" w:themeShade="BF" w:sz="6"/>
-              <w:left w:val="single" w:color="BFBFBF" w:themeColor="background1" w:themeShade="BF" w:sz="6"/>
-              <w:bottom w:val="single" w:color="BFBFBF" w:themeColor="background1" w:themeShade="BF" w:sz="6"/>
-              <w:right w:val="single" w:color="BFBFBF" w:themeColor="background1" w:themeShade="BF" w:sz="6"/>
+              <w:top w:val="single" w:color="BFBFBF" w:themeColor="background1" w:themeShade="BF" w:sz="2"/>
+              <w:left w:val="single" w:color="BFBFBF" w:themeColor="background1" w:themeShade="BF" w:sz="2"/>
+              <w:bottom w:val="single" w:color="BFBFBF" w:themeColor="background1" w:themeShade="BF" w:sz="2"/>
+              <w:right w:val="single" w:color="BFBFBF" w:themeColor="background1" w:themeShade="BF" w:sz="2"/>
             </w:tcBorders>
             <w:tcMar>
               <w:top w:w="45" w:type="dxa"/>
@@ -10881,6 +10912,8 @@
           <w:p>
             <w:pPr>
               <w:jc w:val="center"/>
+            </w:pPr>
+            <w:r>
               <w:rPr>
                 <w:rFonts w:ascii="Arial" w:hAnsi="Arial" w:eastAsia="Arial" w:cs="Arial"/>
                 <w:b w:val="0"/>
@@ -10891,118 +10924,42 @@
                 <w:szCs w:val="18"/>
                 <w:lang w:val="en-IE"/>
               </w:rPr>
-            </w:pPr>
+              <w:t>14</w:t>
+            </w:r>
           </w:p>
         </w:tc>
         <w:tc>
           <w:tcPr>
             <w:tcW w:w="2204" w:type="dxa"/>
             <w:tcBorders>
-              <w:top w:val="single" w:color="BFBFBF" w:themeColor="background1" w:themeShade="BF" w:sz="6"/>
-              <w:left w:val="single" w:color="BFBFBF" w:themeColor="background1" w:themeShade="BF" w:sz="6"/>
-              <w:bottom w:val="single" w:color="BFBFBF" w:themeColor="background1" w:themeShade="BF" w:sz="6"/>
-              <w:right w:val="single" w:color="000000" w:themeColor="text1" w:sz="12"/>
-            </w:tcBorders>
-            <w:tcMar>
-              <w:top w:w="45" w:type="dxa"/>
-              <w:left w:w="60" w:type="dxa"/>
-              <w:bottom w:w="45" w:type="dxa"/>
-              <w:right w:w="60" w:type="dxa"/>
-            </w:tcMar>
-            <w:vAlign w:val="top"/>
-          </w:tcPr>
-          <w:p>
-            <w:pPr>
-              <w:spacing w:before="0" w:after="0"/>
-              <w:jc w:val="center"/>
-              <w:rPr>
-                <w:rFonts w:ascii="Arial" w:hAnsi="Arial" w:eastAsia="Arial" w:cs="Arial"/>
-                <w:b w:val="0"/>
-                <w:bCs w:val="0"/>
-                <w:i w:val="0"/>
-                <w:iCs w:val="0"/>
-                <w:sz w:val="20"/>
-                <w:szCs w:val="20"/>
+              <w:top w:val="single" w:color="BFBFBF" w:themeColor="background1" w:themeShade="BF" w:sz="2"/>
+              <w:left w:val="single" w:color="BFBFBF" w:themeColor="background1" w:themeShade="BF" w:sz="2"/>
+              <w:bottom w:val="single" w:color="BFBFBF" w:themeColor="background1" w:themeShade="BF" w:sz="2"/>
+              <w:right w:val="single" w:color="000000" w:themeColor="text1" w:sz="2"/>
+            </w:tcBorders>
+            <w:tcMar>
+              <w:top w:w="45" w:type="dxa"/>
+              <w:left w:w="60" w:type="dxa"/>
+              <w:bottom w:w="45" w:type="dxa"/>
+              <w:right w:w="60" w:type="dxa"/>
+            </w:tcMar>
+            <w:vAlign w:val="top"/>
+          </w:tcPr>
+          <w:p>
+            <w:pPr>
+              <w:spacing w:before="0" w:after="0"/>
+              <w:jc w:val="left"/>
+              <w:rPr>
+                <w:rFonts w:ascii="Arial" w:hAnsi="Arial" w:eastAsia="Arial" w:cs="Arial"/>
+                <w:b w:val="0"/>
+                <w:bCs w:val="0"/>
+                <w:i w:val="0"/>
+                <w:iCs w:val="0"/>
+                <w:sz w:val="18"/>
+                <w:szCs w:val="18"/>
               </w:rPr>
             </w:pPr>
             <w:r>
-              <w:rPr>
-                <w:rFonts w:ascii="Arial" w:hAnsi="Arial" w:eastAsia="Arial" w:cs="Arial"/>
-                <w:b w:val="1"/>
-                <w:bCs w:val="1"/>
-                <w:i w:val="0"/>
-                <w:iCs w:val="0"/>
-                <w:sz w:val="20"/>
-                <w:szCs w:val="20"/>
-                <w:lang w:val="en-IE"/>
-              </w:rPr>
-              <w:t>Mitigation ranking</w:t>
-            </w:r>
-          </w:p>
-          <w:p>
-            <w:pPr>
-              <w:spacing w:before="0" w:after="0"/>
-              <w:jc w:val="center"/>
-              <w:rPr>
-                <w:rFonts w:ascii="Arial" w:hAnsi="Arial" w:eastAsia="Arial" w:cs="Arial"/>
-                <w:b w:val="0"/>
-                <w:bCs w:val="0"/>
-                <w:i w:val="0"/>
-                <w:iCs w:val="0"/>
-                <w:sz w:val="17"/>
-                <w:szCs w:val="17"/>
-              </w:rPr>
-            </w:pPr>
-            <w:r>
-              <w:rPr>
-                <w:rFonts w:ascii="Arial" w:hAnsi="Arial" w:eastAsia="Arial" w:cs="Arial"/>
-                <w:b w:val="0"/>
-                <w:bCs w:val="0"/>
-                <w:i w:val="0"/>
-                <w:iCs w:val="0"/>
-                <w:sz w:val="17"/>
-                <w:szCs w:val="17"/>
-                <w:lang w:val="en-IE"/>
-              </w:rPr>
-              <w:t>Cost versus price impact</w:t>
-            </w:r>
-          </w:p>
-          <w:p>
-            <w:pPr>
-              <w:jc w:val="center"/>
-              <w:rPr>
-                <w:rFonts w:ascii="Arial" w:hAnsi="Arial" w:eastAsia="Arial" w:cs="Arial"/>
-                <w:b w:val="0"/>
-                <w:bCs w:val="0"/>
-                <w:i w:val="0"/>
-                <w:iCs w:val="0"/>
-                <w:sz w:val="20"/>
-                <w:szCs w:val="20"/>
-                <w:lang w:val="en-IE"/>
-              </w:rPr>
-            </w:pPr>
-          </w:p>
-        </w:tc>
-        <w:tc>
-          <w:tcPr>
-            <w:tcW w:w="500" w:type="dxa"/>
-            <w:tcBorders>
-              <w:top w:val="nil"/>
-              <w:left w:val="single" w:color="000000" w:themeColor="text1" w:sz="12"/>
-              <w:bottom w:val="nil"/>
-              <w:right w:val="nil"/>
-            </w:tcBorders>
-            <w:tcMar>
-              <w:top w:w="45" w:type="dxa"/>
-              <w:left w:w="60" w:type="dxa"/>
-              <w:bottom w:w="45" w:type="dxa"/>
-              <w:right w:w="60" w:type="dxa"/>
-            </w:tcMar>
-            <w:vAlign w:val="top"/>
-          </w:tcPr>
-          <w:p>
-            <w:pPr>
-              <w:jc w:val="center"/>
               <w:rPr>
                 <w:rFonts w:ascii="Arial" w:hAnsi="Arial" w:eastAsia="Arial" w:cs="Arial"/>
                 <w:b w:val="0"/>
@@ -11013,29 +10970,24 @@
                 <w:szCs w:val="18"/>
                 <w:lang w:val="en-IE"/>
               </w:rPr>
-            </w:pPr>
-          </w:p>
-        </w:tc>
-        <w:tc>
-          <w:tcPr>
-            <w:tcW w:w="490" w:type="dxa"/>
-            <w:tcBorders>
-              <w:top w:val="nil"/>
-              <w:left w:val="nil"/>
-              <w:bottom w:val="nil"/>
-              <w:right w:val="nil"/>
-            </w:tcBorders>
-            <w:tcMar>
-              <w:top w:w="45" w:type="dxa"/>
-              <w:left w:w="60" w:type="dxa"/>
-              <w:bottom w:w="45" w:type="dxa"/>
-              <w:right w:w="60" w:type="dxa"/>
-            </w:tcMar>
-            <w:vAlign w:val="top"/>
-          </w:tcPr>
-          <w:p>
-            <w:pPr>
-              <w:jc w:val="center"/>
+              <w:t>Mitigation ranking</w:t>
+            </w:r>
+          </w:p>
+          <w:p>
+            <w:pPr>
+              <w:spacing w:before="0" w:after="0"/>
+              <w:jc w:val="left"/>
+              <w:rPr>
+                <w:rFonts w:ascii="Arial" w:hAnsi="Arial" w:eastAsia="Arial" w:cs="Arial"/>
+                <w:b w:val="0"/>
+                <w:bCs w:val="0"/>
+                <w:i w:val="0"/>
+                <w:iCs w:val="0"/>
+                <w:sz w:val="18"/>
+                <w:szCs w:val="18"/>
+              </w:rPr>
+            </w:pPr>
+            <w:r>
               <w:rPr>
                 <w:rFonts w:ascii="Arial" w:hAnsi="Arial" w:eastAsia="Arial" w:cs="Arial"/>
                 <w:b w:val="0"/>
@@ -11046,15 +10998,16 @@
                 <w:szCs w:val="18"/>
                 <w:lang w:val="en-IE"/>
               </w:rPr>
-            </w:pPr>
-          </w:p>
-        </w:tc>
-        <w:tc>
-          <w:tcPr>
-            <w:tcW w:w="490" w:type="dxa"/>
-            <w:tcBorders>
-              <w:top w:val="nil"/>
-              <w:left w:val="nil"/>
+              <w:t>Cost versus price impact</w:t>
+            </w:r>
+          </w:p>
+        </w:tc>
+        <w:tc>
+          <w:tcPr>
+            <w:tcW w:w="500" w:type="dxa"/>
+            <w:tcBorders>
+              <w:top w:val="nil"/>
+              <w:left w:val="single" w:color="000000" w:themeColor="text1" w:sz="2"/>
               <w:bottom w:val="nil"/>
               <w:right w:val="nil"/>
             </w:tcBorders>
@@ -11084,6 +11037,39 @@
         </w:tc>
         <w:tc>
           <w:tcPr>
+            <w:tcW w:w="480" w:type="dxa"/>
+            <w:tcBorders>
+              <w:top w:val="nil"/>
+              <w:left w:val="nil"/>
+              <w:bottom w:val="nil"/>
+              <w:right w:val="nil"/>
+            </w:tcBorders>
+            <w:tcMar>
+              <w:top w:w="45" w:type="dxa"/>
+              <w:left w:w="60" w:type="dxa"/>
+              <w:bottom w:w="45" w:type="dxa"/>
+              <w:right w:w="60" w:type="dxa"/>
+            </w:tcMar>
+            <w:vAlign w:val="top"/>
+          </w:tcPr>
+          <w:p>
+            <w:pPr>
+              <w:jc w:val="center"/>
+              <w:rPr>
+                <w:rFonts w:ascii="Arial" w:hAnsi="Arial" w:eastAsia="Arial" w:cs="Arial"/>
+                <w:b w:val="0"/>
+                <w:bCs w:val="0"/>
+                <w:i w:val="0"/>
+                <w:iCs w:val="0"/>
+                <w:sz w:val="18"/>
+                <w:szCs w:val="18"/>
+                <w:lang w:val="en-IE"/>
+              </w:rPr>
+            </w:pPr>
+          </w:p>
+        </w:tc>
+        <w:tc>
+          <w:tcPr>
             <w:tcW w:w="490" w:type="dxa"/>
             <w:tcBorders>
               <w:top w:val="nil"/>
@@ -11101,15 +11087,15 @@
           </w:tcPr>
           <w:p>
             <w:pPr>
-              <w:jc w:val="left"/>
-              <w:rPr>
-                <w:rFonts w:ascii="Arial" w:hAnsi="Arial" w:eastAsia="Arial" w:cs="Arial"/>
-                <w:b w:val="0"/>
-                <w:bCs w:val="0"/>
-                <w:i w:val="0"/>
-                <w:iCs w:val="0"/>
-                <w:sz w:val="20"/>
-                <w:szCs w:val="20"/>
+              <w:jc w:val="center"/>
+              <w:rPr>
+                <w:rFonts w:ascii="Arial" w:hAnsi="Arial" w:eastAsia="Arial" w:cs="Arial"/>
+                <w:b w:val="0"/>
+                <w:bCs w:val="0"/>
+                <w:i w:val="0"/>
+                <w:iCs w:val="0"/>
+                <w:sz w:val="18"/>
+                <w:szCs w:val="18"/>
                 <w:lang w:val="en-IE"/>
               </w:rPr>
             </w:pPr>
@@ -11117,6 +11103,39 @@
         </w:tc>
         <w:tc>
           <w:tcPr>
+            <w:tcW w:w="499" w:type="dxa"/>
+            <w:tcBorders>
+              <w:top w:val="nil"/>
+              <w:left w:val="nil"/>
+              <w:bottom w:val="nil"/>
+              <w:right w:val="nil"/>
+            </w:tcBorders>
+            <w:tcMar>
+              <w:top w:w="45" w:type="dxa"/>
+              <w:left w:w="60" w:type="dxa"/>
+              <w:bottom w:w="45" w:type="dxa"/>
+              <w:right w:w="60" w:type="dxa"/>
+            </w:tcMar>
+            <w:vAlign w:val="top"/>
+          </w:tcPr>
+          <w:p>
+            <w:pPr>
+              <w:jc w:val="left"/>
+              <w:rPr>
+                <w:rFonts w:ascii="Arial" w:hAnsi="Arial" w:eastAsia="Arial" w:cs="Arial"/>
+                <w:b w:val="0"/>
+                <w:bCs w:val="0"/>
+                <w:i w:val="0"/>
+                <w:iCs w:val="0"/>
+                <w:sz w:val="20"/>
+                <w:szCs w:val="20"/>
+                <w:lang w:val="en-IE"/>
+              </w:rPr>
+            </w:pPr>
+          </w:p>
+        </w:tc>
+        <w:tc>
+          <w:tcPr>
             <w:tcW w:w="505" w:type="dxa"/>
             <w:tcBorders>
               <w:top w:val="nil"/>
@@ -11256,6 +11275,7 @@
               <w:bottom w:val="nil"/>
               <w:right w:val="nil"/>
             </w:tcBorders>
+            <w:shd w:val="clear" w:color="auto" w:fill="4C94D8" w:themeFill="text2" w:themeFillTint="80"/>
             <w:tcMar>
               <w:top w:w="45" w:type="dxa"/>
               <w:left w:w="60" w:type="dxa"/>
@@ -11422,10 +11442,10 @@
           <w:tcPr>
             <w:tcW w:w="245" w:type="dxa"/>
             <w:tcBorders>
-              <w:top w:val="single" w:color="BFBFBF" w:themeColor="background1" w:themeShade="BF" w:sz="6"/>
-              <w:left w:val="single" w:color="000000" w:themeColor="text1" w:sz="12"/>
-              <w:bottom w:val="single" w:color="BFBFBF" w:themeColor="background1" w:themeShade="BF" w:sz="6"/>
-              <w:right w:val="single" w:color="BFBFBF" w:themeColor="background1" w:themeShade="BF" w:sz="6"/>
+              <w:top w:val="single" w:color="BFBFBF" w:themeColor="background1" w:themeShade="BF" w:sz="2"/>
+              <w:left w:val="single" w:color="000000" w:themeColor="text1" w:sz="2"/>
+              <w:bottom w:val="single" w:color="BFBFBF" w:themeColor="background1" w:themeShade="BF" w:sz="2"/>
+              <w:right w:val="single" w:color="BFBFBF" w:themeColor="background1" w:themeShade="BF" w:sz="2"/>
             </w:tcBorders>
             <w:tcMar>
               <w:top w:w="45" w:type="dxa"/>
@@ -11438,6 +11458,8 @@
           <w:p>
             <w:pPr>
               <w:jc w:val="center"/>
+            </w:pPr>
+            <w:r>
               <w:rPr>
                 <w:rFonts w:ascii="Arial" w:hAnsi="Arial" w:eastAsia="Arial" w:cs="Arial"/>
                 <w:b w:val="0"/>
@@ -11448,158 +11470,93 @@
                 <w:szCs w:val="18"/>
                 <w:lang w:val="en-IE"/>
               </w:rPr>
-            </w:pPr>
+              <w:t>15</w:t>
+            </w:r>
           </w:p>
         </w:tc>
         <w:tc>
           <w:tcPr>
             <w:tcW w:w="2204" w:type="dxa"/>
             <w:tcBorders>
-              <w:top w:val="single" w:color="BFBFBF" w:themeColor="background1" w:themeShade="BF" w:sz="6"/>
-              <w:left w:val="single" w:color="BFBFBF" w:themeColor="background1" w:themeShade="BF" w:sz="6"/>
-              <w:bottom w:val="single" w:color="BFBFBF" w:themeColor="background1" w:themeShade="BF" w:sz="6"/>
-              <w:right w:val="single" w:color="000000" w:themeColor="text1" w:sz="12"/>
-            </w:tcBorders>
-            <w:tcMar>
-              <w:top w:w="45" w:type="dxa"/>
-              <w:left w:w="60" w:type="dxa"/>
-              <w:bottom w:w="45" w:type="dxa"/>
-              <w:right w:w="60" w:type="dxa"/>
-            </w:tcMar>
-            <w:vAlign w:val="top"/>
-          </w:tcPr>
-          <w:p>
-            <w:pPr>
-              <w:spacing w:before="0" w:after="0"/>
-              <w:jc w:val="center"/>
-              <w:rPr>
-                <w:rFonts w:ascii="Arial" w:hAnsi="Arial" w:eastAsia="Arial" w:cs="Arial"/>
-                <w:b w:val="0"/>
-                <w:bCs w:val="0"/>
-                <w:i w:val="0"/>
-                <w:iCs w:val="0"/>
-                <w:color w:val="2C2C2A"/>
-                <w:sz w:val="20"/>
-                <w:szCs w:val="20"/>
+              <w:top w:val="single" w:color="BFBFBF" w:themeColor="background1" w:themeShade="BF" w:sz="2"/>
+              <w:left w:val="single" w:color="BFBFBF" w:themeColor="background1" w:themeShade="BF" w:sz="2"/>
+              <w:bottom w:val="single" w:color="BFBFBF" w:themeColor="background1" w:themeShade="BF" w:sz="2"/>
+              <w:right w:val="single" w:color="000000" w:themeColor="text1" w:sz="2"/>
+            </w:tcBorders>
+            <w:tcMar>
+              <w:top w:w="45" w:type="dxa"/>
+              <w:left w:w="60" w:type="dxa"/>
+              <w:bottom w:w="45" w:type="dxa"/>
+              <w:right w:w="60" w:type="dxa"/>
+            </w:tcMar>
+            <w:vAlign w:val="top"/>
+          </w:tcPr>
+          <w:p>
+            <w:pPr>
+              <w:spacing w:before="0" w:after="0"/>
+              <w:jc w:val="left"/>
+              <w:rPr>
+                <w:rFonts w:ascii="Arial" w:hAnsi="Arial" w:eastAsia="Arial" w:cs="Arial"/>
+                <w:b w:val="0"/>
+                <w:bCs w:val="0"/>
+                <w:i w:val="0"/>
+                <w:iCs w:val="0"/>
+                <w:color w:val="000000" w:themeColor="text1" w:themeTint="FF" w:themeShade="FF"/>
+                <w:sz w:val="18"/>
+                <w:szCs w:val="18"/>
               </w:rPr>
             </w:pPr>
             <w:r>
               <w:rPr>
                 <w:rFonts w:ascii="Arial" w:hAnsi="Arial" w:eastAsia="Arial" w:cs="Arial"/>
-                <w:b w:val="1"/>
-                <w:bCs w:val="1"/>
-                <w:i w:val="0"/>
-                <w:iCs w:val="0"/>
-                <w:color w:val="2C2C2A"/>
-                <w:sz w:val="20"/>
-                <w:szCs w:val="20"/>
-                <w:lang w:val="en-IE"/>
-              </w:rPr>
-              <w:t>Decision dashboard</w:t>
-            </w:r>
-          </w:p>
-          <w:p>
-            <w:pPr>
-              <w:jc w:val="center"/>
-              <w:rPr>
-                <w:rFonts w:ascii="Arial" w:hAnsi="Arial" w:eastAsia="Arial" w:cs="Arial"/>
-                <w:b w:val="0"/>
-                <w:bCs w:val="0"/>
-                <w:i w:val="0"/>
-                <w:iCs w:val="0"/>
-                <w:color w:val="5F5E5A"/>
-                <w:sz w:val="17"/>
-                <w:szCs w:val="17"/>
-              </w:rPr>
-            </w:pPr>
-            <w:r>
-              <w:rPr>
-                <w:rFonts w:ascii="Arial" w:hAnsi="Arial" w:eastAsia="Arial" w:cs="Arial"/>
-                <w:b w:val="0"/>
-                <w:bCs w:val="0"/>
-                <w:i w:val="0"/>
-                <w:iCs w:val="0"/>
-                <w:color w:val="5F5E5A"/>
-                <w:sz w:val="17"/>
-                <w:szCs w:val="17"/>
-                <w:lang w:val="en-IE"/>
-              </w:rPr>
-              <w:t>Impact and options</w:t>
-            </w:r>
-          </w:p>
-        </w:tc>
-        <w:tc>
-          <w:tcPr>
-            <w:tcW w:w="500" w:type="dxa"/>
-            <w:tcBorders>
-              <w:top w:val="nil"/>
-              <w:left w:val="single" w:color="000000" w:themeColor="text1" w:sz="12"/>
-              <w:bottom w:val="nil"/>
-              <w:right w:val="nil"/>
-            </w:tcBorders>
-            <w:tcMar>
-              <w:top w:w="45" w:type="dxa"/>
-              <w:left w:w="60" w:type="dxa"/>
-              <w:bottom w:w="45" w:type="dxa"/>
-              <w:right w:w="60" w:type="dxa"/>
-            </w:tcMar>
-            <w:vAlign w:val="top"/>
-          </w:tcPr>
-          <w:p>
-            <w:pPr>
-              <w:jc w:val="center"/>
-              <w:rPr>
-                <w:rFonts w:ascii="Arial" w:hAnsi="Arial" w:eastAsia="Arial" w:cs="Arial"/>
-                <w:b w:val="0"/>
-                <w:bCs w:val="0"/>
-                <w:i w:val="0"/>
-                <w:iCs w:val="0"/>
+                <w:b w:val="0"/>
+                <w:bCs w:val="0"/>
+                <w:i w:val="0"/>
+                <w:iCs w:val="0"/>
+                <w:color w:val="000000" w:themeColor="text1" w:themeTint="FF" w:themeShade="FF"/>
                 <w:sz w:val="18"/>
                 <w:szCs w:val="18"/>
                 <w:lang w:val="en-IE"/>
               </w:rPr>
-            </w:pPr>
-          </w:p>
-        </w:tc>
-        <w:tc>
-          <w:tcPr>
-            <w:tcW w:w="490" w:type="dxa"/>
-            <w:tcBorders>
-              <w:top w:val="nil"/>
-              <w:left w:val="nil"/>
-              <w:bottom w:val="nil"/>
-              <w:right w:val="nil"/>
-            </w:tcBorders>
-            <w:tcMar>
-              <w:top w:w="45" w:type="dxa"/>
-              <w:left w:w="60" w:type="dxa"/>
-              <w:bottom w:w="45" w:type="dxa"/>
-              <w:right w:w="60" w:type="dxa"/>
-            </w:tcMar>
-            <w:vAlign w:val="top"/>
-          </w:tcPr>
-          <w:p>
-            <w:pPr>
-              <w:jc w:val="center"/>
-              <w:rPr>
-                <w:rFonts w:ascii="Arial" w:hAnsi="Arial" w:eastAsia="Arial" w:cs="Arial"/>
-                <w:b w:val="0"/>
-                <w:bCs w:val="0"/>
-                <w:i w:val="0"/>
-                <w:iCs w:val="0"/>
+              <w:t>Decision dashboard</w:t>
+            </w:r>
+          </w:p>
+          <w:p>
+            <w:pPr>
+              <w:jc w:val="left"/>
+              <w:rPr>
+                <w:rFonts w:ascii="Arial" w:hAnsi="Arial" w:eastAsia="Arial" w:cs="Arial"/>
+                <w:b w:val="0"/>
+                <w:bCs w:val="0"/>
+                <w:i w:val="0"/>
+                <w:iCs w:val="0"/>
+                <w:color w:val="000000" w:themeColor="text1" w:themeTint="FF" w:themeShade="FF"/>
+                <w:sz w:val="18"/>
+                <w:szCs w:val="18"/>
+              </w:rPr>
+            </w:pPr>
+            <w:r>
+              <w:rPr>
+                <w:rFonts w:ascii="Arial" w:hAnsi="Arial" w:eastAsia="Arial" w:cs="Arial"/>
+                <w:b w:val="0"/>
+                <w:bCs w:val="0"/>
+                <w:i w:val="0"/>
+                <w:iCs w:val="0"/>
+                <w:color w:val="000000" w:themeColor="text1" w:themeTint="FF" w:themeShade="FF"/>
                 <w:sz w:val="18"/>
                 <w:szCs w:val="18"/>
                 <w:lang w:val="en-IE"/>
               </w:rPr>
-            </w:pPr>
-          </w:p>
-        </w:tc>
-        <w:tc>
-          <w:tcPr>
-            <w:tcW w:w="490" w:type="dxa"/>
-            <w:tcBorders>
-              <w:top w:val="nil"/>
-              <w:left w:val="nil"/>
+              <w:t>Impact and options</w:t>
+            </w:r>
+          </w:p>
+        </w:tc>
+        <w:tc>
+          <w:tcPr>
+            <w:tcW w:w="500" w:type="dxa"/>
+            <w:tcBorders>
+              <w:top w:val="nil"/>
+              <w:left w:val="single" w:color="000000" w:themeColor="text1" w:sz="2"/>
               <w:bottom w:val="nil"/>
               <w:right w:val="nil"/>
             </w:tcBorders>
@@ -11629,6 +11586,39 @@
         </w:tc>
         <w:tc>
           <w:tcPr>
+            <w:tcW w:w="480" w:type="dxa"/>
+            <w:tcBorders>
+              <w:top w:val="nil"/>
+              <w:left w:val="nil"/>
+              <w:bottom w:val="nil"/>
+              <w:right w:val="nil"/>
+            </w:tcBorders>
+            <w:tcMar>
+              <w:top w:w="45" w:type="dxa"/>
+              <w:left w:w="60" w:type="dxa"/>
+              <w:bottom w:w="45" w:type="dxa"/>
+              <w:right w:w="60" w:type="dxa"/>
+            </w:tcMar>
+            <w:vAlign w:val="top"/>
+          </w:tcPr>
+          <w:p>
+            <w:pPr>
+              <w:jc w:val="center"/>
+              <w:rPr>
+                <w:rFonts w:ascii="Arial" w:hAnsi="Arial" w:eastAsia="Arial" w:cs="Arial"/>
+                <w:b w:val="0"/>
+                <w:bCs w:val="0"/>
+                <w:i w:val="0"/>
+                <w:iCs w:val="0"/>
+                <w:sz w:val="18"/>
+                <w:szCs w:val="18"/>
+                <w:lang w:val="en-IE"/>
+              </w:rPr>
+            </w:pPr>
+          </w:p>
+        </w:tc>
+        <w:tc>
+          <w:tcPr>
             <w:tcW w:w="490" w:type="dxa"/>
             <w:tcBorders>
               <w:top w:val="nil"/>
@@ -11646,15 +11636,15 @@
           </w:tcPr>
           <w:p>
             <w:pPr>
-              <w:jc w:val="left"/>
-              <w:rPr>
-                <w:rFonts w:ascii="Arial" w:hAnsi="Arial" w:eastAsia="Arial" w:cs="Arial"/>
-                <w:b w:val="0"/>
-                <w:bCs w:val="0"/>
-                <w:i w:val="0"/>
-                <w:iCs w:val="0"/>
-                <w:sz w:val="20"/>
-                <w:szCs w:val="20"/>
+              <w:jc w:val="center"/>
+              <w:rPr>
+                <w:rFonts w:ascii="Arial" w:hAnsi="Arial" w:eastAsia="Arial" w:cs="Arial"/>
+                <w:b w:val="0"/>
+                <w:bCs w:val="0"/>
+                <w:i w:val="0"/>
+                <w:iCs w:val="0"/>
+                <w:sz w:val="18"/>
+                <w:szCs w:val="18"/>
                 <w:lang w:val="en-IE"/>
               </w:rPr>
             </w:pPr>
@@ -11662,6 +11652,39 @@
         </w:tc>
         <w:tc>
           <w:tcPr>
+            <w:tcW w:w="499" w:type="dxa"/>
+            <w:tcBorders>
+              <w:top w:val="nil"/>
+              <w:left w:val="nil"/>
+              <w:bottom w:val="nil"/>
+              <w:right w:val="nil"/>
+            </w:tcBorders>
+            <w:tcMar>
+              <w:top w:w="45" w:type="dxa"/>
+              <w:left w:w="60" w:type="dxa"/>
+              <w:bottom w:w="45" w:type="dxa"/>
+              <w:right w:w="60" w:type="dxa"/>
+            </w:tcMar>
+            <w:vAlign w:val="top"/>
+          </w:tcPr>
+          <w:p>
+            <w:pPr>
+              <w:jc w:val="left"/>
+              <w:rPr>
+                <w:rFonts w:ascii="Arial" w:hAnsi="Arial" w:eastAsia="Arial" w:cs="Arial"/>
+                <w:b w:val="0"/>
+                <w:bCs w:val="0"/>
+                <w:i w:val="0"/>
+                <w:iCs w:val="0"/>
+                <w:sz w:val="20"/>
+                <w:szCs w:val="20"/>
+                <w:lang w:val="en-IE"/>
+              </w:rPr>
+            </w:pPr>
+          </w:p>
+        </w:tc>
+        <w:tc>
+          <w:tcPr>
             <w:tcW w:w="505" w:type="dxa"/>
             <w:tcBorders>
               <w:top w:val="nil"/>
@@ -11801,6 +11824,7 @@
               <w:bottom w:val="nil"/>
               <w:right w:val="nil"/>
             </w:tcBorders>
+            <w:shd w:val="clear" w:color="auto" w:fill="4C94D8" w:themeFill="text2" w:themeFillTint="80"/>
             <w:tcMar>
               <w:top w:w="45" w:type="dxa"/>
               <w:left w:w="60" w:type="dxa"/>
@@ -11967,10 +11991,10 @@
           <w:tcPr>
             <w:tcW w:w="245" w:type="dxa"/>
             <w:tcBorders>
-              <w:top w:val="single" w:color="BFBFBF" w:themeColor="background1" w:themeShade="BF" w:sz="6"/>
-              <w:left w:val="single" w:color="000000" w:themeColor="text1" w:sz="12"/>
-              <w:bottom w:val="single" w:color="BFBFBF" w:themeColor="background1" w:themeShade="BF" w:sz="6"/>
-              <w:right w:val="single" w:color="BFBFBF" w:themeColor="background1" w:themeShade="BF" w:sz="6"/>
+              <w:top w:val="single" w:color="BFBFBF" w:themeColor="background1" w:themeShade="BF" w:sz="2"/>
+              <w:left w:val="single" w:color="000000" w:themeColor="text1" w:sz="2"/>
+              <w:bottom w:val="single" w:color="BFBFBF" w:themeColor="background1" w:themeShade="BF" w:sz="2"/>
+              <w:right w:val="single" w:color="BFBFBF" w:themeColor="background1" w:themeShade="BF" w:sz="2"/>
             </w:tcBorders>
             <w:tcMar>
               <w:top w:w="45" w:type="dxa"/>
@@ -11983,6 +12007,8 @@
           <w:p>
             <w:pPr>
               <w:jc w:val="center"/>
+            </w:pPr>
+            <w:r>
               <w:rPr>
                 <w:rFonts w:ascii="Arial" w:hAnsi="Arial" w:eastAsia="Arial" w:cs="Arial"/>
                 <w:b w:val="0"/>
@@ -11993,174 +12019,94 @@
                 <w:szCs w:val="18"/>
                 <w:lang w:val="en-IE"/>
               </w:rPr>
-            </w:pPr>
+              <w:t>16</w:t>
+            </w:r>
           </w:p>
         </w:tc>
         <w:tc>
           <w:tcPr>
             <w:tcW w:w="2204" w:type="dxa"/>
             <w:tcBorders>
-              <w:top w:val="single" w:color="BFBFBF" w:themeColor="background1" w:themeShade="BF" w:sz="6"/>
-              <w:left w:val="single" w:color="BFBFBF" w:themeColor="background1" w:themeShade="BF" w:sz="6"/>
-              <w:bottom w:val="single" w:color="BFBFBF" w:themeColor="background1" w:themeShade="BF" w:sz="6"/>
-              <w:right w:val="single" w:color="000000" w:themeColor="text1" w:sz="12"/>
-            </w:tcBorders>
-            <w:tcMar>
-              <w:top w:w="45" w:type="dxa"/>
-              <w:left w:w="60" w:type="dxa"/>
-              <w:bottom w:w="45" w:type="dxa"/>
-              <w:right w:w="60" w:type="dxa"/>
-            </w:tcMar>
-            <w:vAlign w:val="top"/>
-          </w:tcPr>
-          <w:p>
-            <w:pPr>
-              <w:spacing w:before="0" w:after="0"/>
-              <w:jc w:val="center"/>
-              <w:rPr>
-                <w:rFonts w:ascii="Arial" w:hAnsi="Arial" w:eastAsia="Arial" w:cs="Arial"/>
-                <w:b w:val="0"/>
-                <w:bCs w:val="0"/>
-                <w:i w:val="0"/>
-                <w:iCs w:val="0"/>
-                <w:color w:val="2C2C2A"/>
-                <w:sz w:val="20"/>
-                <w:szCs w:val="20"/>
+              <w:top w:val="single" w:color="BFBFBF" w:themeColor="background1" w:themeShade="BF" w:sz="2"/>
+              <w:left w:val="single" w:color="BFBFBF" w:themeColor="background1" w:themeShade="BF" w:sz="2"/>
+              <w:bottom w:val="single" w:color="BFBFBF" w:themeColor="background1" w:themeShade="BF" w:sz="2"/>
+              <w:right w:val="single" w:color="000000" w:themeColor="text1" w:sz="2"/>
+            </w:tcBorders>
+            <w:tcMar>
+              <w:top w:w="45" w:type="dxa"/>
+              <w:left w:w="60" w:type="dxa"/>
+              <w:bottom w:w="45" w:type="dxa"/>
+              <w:right w:w="60" w:type="dxa"/>
+            </w:tcMar>
+            <w:vAlign w:val="top"/>
+          </w:tcPr>
+          <w:p>
+            <w:pPr>
+              <w:spacing w:before="0" w:after="0"/>
+              <w:jc w:val="left"/>
+              <w:rPr>
+                <w:rFonts w:ascii="Arial" w:hAnsi="Arial" w:eastAsia="Arial" w:cs="Arial"/>
+                <w:b w:val="0"/>
+                <w:bCs w:val="0"/>
+                <w:i w:val="0"/>
+                <w:iCs w:val="0"/>
+                <w:color w:val="000000" w:themeColor="text1" w:themeTint="FF" w:themeShade="FF"/>
+                <w:sz w:val="18"/>
+                <w:szCs w:val="18"/>
               </w:rPr>
             </w:pPr>
             <w:r>
               <w:rPr>
                 <w:rFonts w:ascii="Arial" w:hAnsi="Arial" w:eastAsia="Arial" w:cs="Arial"/>
-                <w:b w:val="1"/>
-                <w:bCs w:val="1"/>
-                <w:i w:val="0"/>
-                <w:iCs w:val="0"/>
-                <w:color w:val="2C2C2A"/>
-                <w:sz w:val="20"/>
-                <w:szCs w:val="20"/>
-                <w:lang w:val="en-IE"/>
-              </w:rPr>
-              <w:t>Recommendations</w:t>
-            </w:r>
-          </w:p>
-          <w:p>
-            <w:pPr>
-              <w:spacing w:before="0" w:after="0"/>
-              <w:jc w:val="center"/>
-              <w:rPr>
-                <w:rFonts w:ascii="Arial" w:hAnsi="Arial" w:eastAsia="Arial" w:cs="Arial"/>
-                <w:b w:val="0"/>
-                <w:bCs w:val="0"/>
-                <w:i w:val="0"/>
-                <w:iCs w:val="0"/>
-                <w:color w:val="5F5E5A"/>
-                <w:sz w:val="17"/>
-                <w:szCs w:val="17"/>
-              </w:rPr>
-            </w:pPr>
-            <w:r>
-              <w:rPr>
-                <w:rFonts w:ascii="Arial" w:hAnsi="Arial" w:eastAsia="Arial" w:cs="Arial"/>
-                <w:b w:val="0"/>
-                <w:bCs w:val="0"/>
-                <w:i w:val="0"/>
-                <w:iCs w:val="0"/>
-                <w:color w:val="5F5E5A"/>
-                <w:sz w:val="17"/>
-                <w:szCs w:val="17"/>
-                <w:lang w:val="en-IE"/>
-              </w:rPr>
-              <w:t>Best mitigation action</w:t>
-            </w:r>
-          </w:p>
-          <w:p>
-            <w:pPr>
-              <w:jc w:val="center"/>
-              <w:rPr>
-                <w:rFonts w:ascii="Arial" w:hAnsi="Arial" w:eastAsia="Arial" w:cs="Arial"/>
-                <w:b w:val="0"/>
-                <w:bCs w:val="0"/>
-                <w:i w:val="0"/>
-                <w:iCs w:val="0"/>
-                <w:sz w:val="20"/>
-                <w:szCs w:val="20"/>
-                <w:lang w:val="en-IE"/>
-              </w:rPr>
-            </w:pPr>
-          </w:p>
-        </w:tc>
-        <w:tc>
-          <w:tcPr>
-            <w:tcW w:w="500" w:type="dxa"/>
-            <w:tcBorders>
-              <w:top w:val="nil"/>
-              <w:left w:val="single" w:color="000000" w:themeColor="text1" w:sz="12"/>
-              <w:bottom w:val="nil"/>
-              <w:right w:val="nil"/>
-            </w:tcBorders>
-            <w:tcMar>
-              <w:top w:w="45" w:type="dxa"/>
-              <w:left w:w="60" w:type="dxa"/>
-              <w:bottom w:w="45" w:type="dxa"/>
-              <w:right w:w="60" w:type="dxa"/>
-            </w:tcMar>
-            <w:vAlign w:val="top"/>
-          </w:tcPr>
-          <w:p>
-            <w:pPr>
-              <w:jc w:val="center"/>
-              <w:rPr>
-                <w:rFonts w:ascii="Arial" w:hAnsi="Arial" w:eastAsia="Arial" w:cs="Arial"/>
-                <w:b w:val="0"/>
-                <w:bCs w:val="0"/>
-                <w:i w:val="0"/>
-                <w:iCs w:val="0"/>
+                <w:b w:val="0"/>
+                <w:bCs w:val="0"/>
+                <w:i w:val="0"/>
+                <w:iCs w:val="0"/>
+                <w:color w:val="000000" w:themeColor="text1" w:themeTint="FF" w:themeShade="FF"/>
                 <w:sz w:val="18"/>
                 <w:szCs w:val="18"/>
                 <w:lang w:val="en-IE"/>
               </w:rPr>
-            </w:pPr>
-          </w:p>
-        </w:tc>
-        <w:tc>
-          <w:tcPr>
-            <w:tcW w:w="490" w:type="dxa"/>
-            <w:tcBorders>
-              <w:top w:val="nil"/>
-              <w:left w:val="nil"/>
-              <w:bottom w:val="nil"/>
-              <w:right w:val="nil"/>
-            </w:tcBorders>
-            <w:tcMar>
-              <w:top w:w="45" w:type="dxa"/>
-              <w:left w:w="60" w:type="dxa"/>
-              <w:bottom w:w="45" w:type="dxa"/>
-              <w:right w:w="60" w:type="dxa"/>
-            </w:tcMar>
-            <w:vAlign w:val="top"/>
-          </w:tcPr>
-          <w:p>
-            <w:pPr>
-              <w:jc w:val="center"/>
-              <w:rPr>
-                <w:rFonts w:ascii="Arial" w:hAnsi="Arial" w:eastAsia="Arial" w:cs="Arial"/>
-                <w:b w:val="0"/>
-                <w:bCs w:val="0"/>
-                <w:i w:val="0"/>
-                <w:iCs w:val="0"/>
+              <w:t>Recommendations</w:t>
+            </w:r>
+          </w:p>
+          <w:p>
+            <w:pPr>
+              <w:spacing w:before="0" w:after="0"/>
+              <w:jc w:val="left"/>
+              <w:rPr>
+                <w:rFonts w:ascii="Arial" w:hAnsi="Arial" w:eastAsia="Arial" w:cs="Arial"/>
+                <w:b w:val="0"/>
+                <w:bCs w:val="0"/>
+                <w:i w:val="0"/>
+                <w:iCs w:val="0"/>
+                <w:color w:val="000000" w:themeColor="text1" w:themeTint="FF" w:themeShade="FF"/>
+                <w:sz w:val="17"/>
+                <w:szCs w:val="17"/>
+              </w:rPr>
+            </w:pPr>
+            <w:r>
+              <w:rPr>
+                <w:rFonts w:ascii="Arial" w:hAnsi="Arial" w:eastAsia="Arial" w:cs="Arial"/>
+                <w:b w:val="0"/>
+                <w:bCs w:val="0"/>
+                <w:i w:val="0"/>
+                <w:iCs w:val="0"/>
+                <w:color w:val="000000" w:themeColor="text1" w:themeTint="FF" w:themeShade="FF"/>
                 <w:sz w:val="18"/>
                 <w:szCs w:val="18"/>
                 <w:lang w:val="en-IE"/>
               </w:rPr>
-            </w:pPr>
-          </w:p>
-        </w:tc>
-        <w:tc>
-          <w:tcPr>
-            <w:tcW w:w="490" w:type="dxa"/>
-            <w:tcBorders>
-              <w:top w:val="nil"/>
-              <w:left w:val="nil"/>
+              <w:t>Best mitigation action</w:t>
+            </w:r>
+          </w:p>
+        </w:tc>
+        <w:tc>
+          <w:tcPr>
+            <w:tcW w:w="500" w:type="dxa"/>
+            <w:tcBorders>
+              <w:top w:val="nil"/>
+              <w:left w:val="single" w:color="000000" w:themeColor="text1" w:sz="2"/>
               <w:bottom w:val="nil"/>
               <w:right w:val="nil"/>
             </w:tcBorders>
@@ -12190,6 +12136,39 @@
         </w:tc>
         <w:tc>
           <w:tcPr>
+            <w:tcW w:w="480" w:type="dxa"/>
+            <w:tcBorders>
+              <w:top w:val="nil"/>
+              <w:left w:val="nil"/>
+              <w:bottom w:val="nil"/>
+              <w:right w:val="nil"/>
+            </w:tcBorders>
+            <w:tcMar>
+              <w:top w:w="45" w:type="dxa"/>
+              <w:left w:w="60" w:type="dxa"/>
+              <w:bottom w:w="45" w:type="dxa"/>
+              <w:right w:w="60" w:type="dxa"/>
+            </w:tcMar>
+            <w:vAlign w:val="top"/>
+          </w:tcPr>
+          <w:p>
+            <w:pPr>
+              <w:jc w:val="center"/>
+              <w:rPr>
+                <w:rFonts w:ascii="Arial" w:hAnsi="Arial" w:eastAsia="Arial" w:cs="Arial"/>
+                <w:b w:val="0"/>
+                <w:bCs w:val="0"/>
+                <w:i w:val="0"/>
+                <w:iCs w:val="0"/>
+                <w:sz w:val="18"/>
+                <w:szCs w:val="18"/>
+                <w:lang w:val="en-IE"/>
+              </w:rPr>
+            </w:pPr>
+          </w:p>
+        </w:tc>
+        <w:tc>
+          <w:tcPr>
             <w:tcW w:w="490" w:type="dxa"/>
             <w:tcBorders>
               <w:top w:val="nil"/>
@@ -12207,15 +12186,15 @@
           </w:tcPr>
           <w:p>
             <w:pPr>
-              <w:jc w:val="left"/>
-              <w:rPr>
-                <w:rFonts w:ascii="Arial" w:hAnsi="Arial" w:eastAsia="Arial" w:cs="Arial"/>
-                <w:b w:val="0"/>
-                <w:bCs w:val="0"/>
-                <w:i w:val="0"/>
-                <w:iCs w:val="0"/>
-                <w:sz w:val="20"/>
-                <w:szCs w:val="20"/>
+              <w:jc w:val="center"/>
+              <w:rPr>
+                <w:rFonts w:ascii="Arial" w:hAnsi="Arial" w:eastAsia="Arial" w:cs="Arial"/>
+                <w:b w:val="0"/>
+                <w:bCs w:val="0"/>
+                <w:i w:val="0"/>
+                <w:iCs w:val="0"/>
+                <w:sz w:val="18"/>
+                <w:szCs w:val="18"/>
                 <w:lang w:val="en-IE"/>
               </w:rPr>
             </w:pPr>
@@ -12223,6 +12202,39 @@
         </w:tc>
         <w:tc>
           <w:tcPr>
+            <w:tcW w:w="499" w:type="dxa"/>
+            <w:tcBorders>
+              <w:top w:val="nil"/>
+              <w:left w:val="nil"/>
+              <w:bottom w:val="nil"/>
+              <w:right w:val="nil"/>
+            </w:tcBorders>
+            <w:tcMar>
+              <w:top w:w="45" w:type="dxa"/>
+              <w:left w:w="60" w:type="dxa"/>
+              <w:bottom w:w="45" w:type="dxa"/>
+              <w:right w:w="60" w:type="dxa"/>
+            </w:tcMar>
+            <w:vAlign w:val="top"/>
+          </w:tcPr>
+          <w:p>
+            <w:pPr>
+              <w:jc w:val="left"/>
+              <w:rPr>
+                <w:rFonts w:ascii="Arial" w:hAnsi="Arial" w:eastAsia="Arial" w:cs="Arial"/>
+                <w:b w:val="0"/>
+                <w:bCs w:val="0"/>
+                <w:i w:val="0"/>
+                <w:iCs w:val="0"/>
+                <w:sz w:val="20"/>
+                <w:szCs w:val="20"/>
+                <w:lang w:val="en-IE"/>
+              </w:rPr>
+            </w:pPr>
+          </w:p>
+        </w:tc>
+        <w:tc>
+          <w:tcPr>
             <w:tcW w:w="505" w:type="dxa"/>
             <w:tcBorders>
               <w:top w:val="nil"/>
@@ -12362,6 +12374,7 @@
               <w:bottom w:val="nil"/>
               <w:right w:val="nil"/>
             </w:tcBorders>
+            <w:shd w:val="clear" w:color="auto" w:fill="4C94D8" w:themeFill="text2" w:themeFillTint="80"/>
             <w:tcMar>
               <w:top w:w="45" w:type="dxa"/>
               <w:left w:w="60" w:type="dxa"/>
@@ -12528,10 +12541,10 @@
           <w:tcPr>
             <w:tcW w:w="245" w:type="dxa"/>
             <w:tcBorders>
-              <w:top w:val="single" w:color="BFBFBF" w:themeColor="background1" w:themeShade="BF" w:sz="6"/>
-              <w:left w:val="single" w:color="000000" w:themeColor="text1" w:sz="12"/>
-              <w:bottom w:val="single" w:color="BFBFBF" w:themeColor="background1" w:themeShade="BF" w:sz="6"/>
-              <w:right w:val="single" w:color="BFBFBF" w:themeColor="background1" w:themeShade="BF" w:sz="6"/>
+              <w:top w:val="single" w:color="BFBFBF" w:themeColor="background1" w:themeShade="BF" w:sz="2"/>
+              <w:left w:val="single" w:color="000000" w:themeColor="text1" w:sz="2"/>
+              <w:bottom w:val="single" w:color="BFBFBF" w:themeColor="background1" w:themeShade="BF" w:sz="2"/>
+              <w:right w:val="single" w:color="BFBFBF" w:themeColor="background1" w:themeShade="BF" w:sz="2"/>
             </w:tcBorders>
             <w:tcMar>
               <w:top w:w="45" w:type="dxa"/>
@@ -12544,6 +12557,8 @@
           <w:p>
             <w:pPr>
               <w:jc w:val="center"/>
+            </w:pPr>
+            <w:r>
               <w:rPr>
                 <w:rFonts w:ascii="Arial" w:hAnsi="Arial" w:eastAsia="Arial" w:cs="Arial"/>
                 <w:b w:val="0"/>
@@ -12554,158 +12569,93 @@
                 <w:szCs w:val="18"/>
                 <w:lang w:val="en-IE"/>
               </w:rPr>
-            </w:pPr>
+              <w:t>17</w:t>
+            </w:r>
           </w:p>
         </w:tc>
         <w:tc>
           <w:tcPr>
             <w:tcW w:w="2204" w:type="dxa"/>
             <w:tcBorders>
-              <w:top w:val="single" w:color="BFBFBF" w:themeColor="background1" w:themeShade="BF" w:sz="6"/>
-              <w:left w:val="single" w:color="BFBFBF" w:themeColor="background1" w:themeShade="BF" w:sz="6"/>
-              <w:bottom w:val="single" w:color="BFBFBF" w:themeColor="background1" w:themeShade="BF" w:sz="6"/>
-              <w:right w:val="single" w:color="000000" w:themeColor="text1" w:sz="12"/>
-            </w:tcBorders>
-            <w:tcMar>
-              <w:top w:w="45" w:type="dxa"/>
-              <w:left w:w="60" w:type="dxa"/>
-              <w:bottom w:w="45" w:type="dxa"/>
-              <w:right w:w="60" w:type="dxa"/>
-            </w:tcMar>
-            <w:vAlign w:val="top"/>
-          </w:tcPr>
-          <w:p>
-            <w:pPr>
-              <w:spacing w:before="0" w:after="0"/>
-              <w:jc w:val="center"/>
-              <w:rPr>
-                <w:rFonts w:ascii="Arial" w:hAnsi="Arial" w:eastAsia="Arial" w:cs="Arial"/>
-                <w:b w:val="0"/>
-                <w:bCs w:val="0"/>
-                <w:i w:val="0"/>
-                <w:iCs w:val="0"/>
-                <w:color w:val="2C2C2A"/>
-                <w:sz w:val="20"/>
-                <w:szCs w:val="20"/>
+              <w:top w:val="single" w:color="BFBFBF" w:themeColor="background1" w:themeShade="BF" w:sz="2"/>
+              <w:left w:val="single" w:color="BFBFBF" w:themeColor="background1" w:themeShade="BF" w:sz="2"/>
+              <w:bottom w:val="single" w:color="BFBFBF" w:themeColor="background1" w:themeShade="BF" w:sz="2"/>
+              <w:right w:val="single" w:color="000000" w:themeColor="text1" w:sz="2"/>
+            </w:tcBorders>
+            <w:tcMar>
+              <w:top w:w="45" w:type="dxa"/>
+              <w:left w:w="60" w:type="dxa"/>
+              <w:bottom w:w="45" w:type="dxa"/>
+              <w:right w:w="60" w:type="dxa"/>
+            </w:tcMar>
+            <w:vAlign w:val="top"/>
+          </w:tcPr>
+          <w:p>
+            <w:pPr>
+              <w:spacing w:before="0" w:after="0"/>
+              <w:jc w:val="left"/>
+              <w:rPr>
+                <w:rFonts w:ascii="Arial" w:hAnsi="Arial" w:eastAsia="Arial" w:cs="Arial"/>
+                <w:b w:val="0"/>
+                <w:bCs w:val="0"/>
+                <w:i w:val="0"/>
+                <w:iCs w:val="0"/>
+                <w:color w:val="000000" w:themeColor="text1" w:themeTint="FF" w:themeShade="FF"/>
+                <w:sz w:val="18"/>
+                <w:szCs w:val="18"/>
               </w:rPr>
             </w:pPr>
             <w:r>
               <w:rPr>
                 <w:rFonts w:ascii="Arial" w:hAnsi="Arial" w:eastAsia="Arial" w:cs="Arial"/>
-                <w:b w:val="1"/>
-                <w:bCs w:val="1"/>
-                <w:i w:val="0"/>
-                <w:iCs w:val="0"/>
-                <w:color w:val="2C2C2A"/>
-                <w:sz w:val="20"/>
-                <w:szCs w:val="20"/>
-                <w:lang w:val="en-IE"/>
-              </w:rPr>
-              <w:t>Monitoring</w:t>
-            </w:r>
-          </w:p>
-          <w:p>
-            <w:pPr>
-              <w:jc w:val="center"/>
-              <w:rPr>
-                <w:rFonts w:ascii="Arial" w:hAnsi="Arial" w:eastAsia="Arial" w:cs="Arial"/>
-                <w:b w:val="0"/>
-                <w:bCs w:val="0"/>
-                <w:i w:val="0"/>
-                <w:iCs w:val="0"/>
-                <w:color w:val="5F5E5A"/>
-                <w:sz w:val="17"/>
-                <w:szCs w:val="17"/>
-              </w:rPr>
-            </w:pPr>
-            <w:r>
-              <w:rPr>
-                <w:rFonts w:ascii="Arial" w:hAnsi="Arial" w:eastAsia="Arial" w:cs="Arial"/>
-                <w:b w:val="0"/>
-                <w:bCs w:val="0"/>
-                <w:i w:val="0"/>
-                <w:iCs w:val="0"/>
-                <w:color w:val="5F5E5A"/>
-                <w:sz w:val="17"/>
-                <w:szCs w:val="17"/>
-                <w:lang w:val="en-IE"/>
-              </w:rPr>
-              <w:t>Retrain on new data</w:t>
-            </w:r>
-          </w:p>
-        </w:tc>
-        <w:tc>
-          <w:tcPr>
-            <w:tcW w:w="500" w:type="dxa"/>
-            <w:tcBorders>
-              <w:top w:val="nil"/>
-              <w:left w:val="single" w:color="000000" w:themeColor="text1" w:sz="12"/>
-              <w:bottom w:val="nil"/>
-              <w:right w:val="nil"/>
-            </w:tcBorders>
-            <w:tcMar>
-              <w:top w:w="45" w:type="dxa"/>
-              <w:left w:w="60" w:type="dxa"/>
-              <w:bottom w:w="45" w:type="dxa"/>
-              <w:right w:w="60" w:type="dxa"/>
-            </w:tcMar>
-            <w:vAlign w:val="top"/>
-          </w:tcPr>
-          <w:p>
-            <w:pPr>
-              <w:jc w:val="center"/>
-              <w:rPr>
-                <w:rFonts w:ascii="Arial" w:hAnsi="Arial" w:eastAsia="Arial" w:cs="Arial"/>
-                <w:b w:val="0"/>
-                <w:bCs w:val="0"/>
-                <w:i w:val="0"/>
-                <w:iCs w:val="0"/>
+                <w:b w:val="0"/>
+                <w:bCs w:val="0"/>
+                <w:i w:val="0"/>
+                <w:iCs w:val="0"/>
+                <w:color w:val="000000" w:themeColor="text1" w:themeTint="FF" w:themeShade="FF"/>
                 <w:sz w:val="18"/>
                 <w:szCs w:val="18"/>
                 <w:lang w:val="en-IE"/>
               </w:rPr>
-            </w:pPr>
-          </w:p>
-        </w:tc>
-        <w:tc>
-          <w:tcPr>
-            <w:tcW w:w="490" w:type="dxa"/>
-            <w:tcBorders>
-              <w:top w:val="nil"/>
-              <w:left w:val="nil"/>
-              <w:bottom w:val="nil"/>
-              <w:right w:val="nil"/>
-            </w:tcBorders>
-            <w:tcMar>
-              <w:top w:w="45" w:type="dxa"/>
-              <w:left w:w="60" w:type="dxa"/>
-              <w:bottom w:w="45" w:type="dxa"/>
-              <w:right w:w="60" w:type="dxa"/>
-            </w:tcMar>
-            <w:vAlign w:val="top"/>
-          </w:tcPr>
-          <w:p>
-            <w:pPr>
-              <w:jc w:val="center"/>
-              <w:rPr>
-                <w:rFonts w:ascii="Arial" w:hAnsi="Arial" w:eastAsia="Arial" w:cs="Arial"/>
-                <w:b w:val="0"/>
-                <w:bCs w:val="0"/>
-                <w:i w:val="0"/>
-                <w:iCs w:val="0"/>
+              <w:t>Monitoring</w:t>
+            </w:r>
+          </w:p>
+          <w:p>
+            <w:pPr>
+              <w:jc w:val="left"/>
+              <w:rPr>
+                <w:rFonts w:ascii="Arial" w:hAnsi="Arial" w:eastAsia="Arial" w:cs="Arial"/>
+                <w:b w:val="0"/>
+                <w:bCs w:val="0"/>
+                <w:i w:val="0"/>
+                <w:iCs w:val="0"/>
+                <w:color w:val="000000" w:themeColor="text1" w:themeTint="FF" w:themeShade="FF"/>
+                <w:sz w:val="18"/>
+                <w:szCs w:val="18"/>
+              </w:rPr>
+            </w:pPr>
+            <w:r>
+              <w:rPr>
+                <w:rFonts w:ascii="Arial" w:hAnsi="Arial" w:eastAsia="Arial" w:cs="Arial"/>
+                <w:b w:val="0"/>
+                <w:bCs w:val="0"/>
+                <w:i w:val="0"/>
+                <w:iCs w:val="0"/>
+                <w:color w:val="000000" w:themeColor="text1" w:themeTint="FF" w:themeShade="FF"/>
                 <w:sz w:val="18"/>
                 <w:szCs w:val="18"/>
                 <w:lang w:val="en-IE"/>
               </w:rPr>
-            </w:pPr>
-          </w:p>
-        </w:tc>
-        <w:tc>
-          <w:tcPr>
-            <w:tcW w:w="490" w:type="dxa"/>
-            <w:tcBorders>
-              <w:top w:val="nil"/>
-              <w:left w:val="nil"/>
+              <w:t>Retrain on new data</w:t>
+            </w:r>
+          </w:p>
+        </w:tc>
+        <w:tc>
+          <w:tcPr>
+            <w:tcW w:w="500" w:type="dxa"/>
+            <w:tcBorders>
+              <w:top w:val="nil"/>
+              <w:left w:val="single" w:color="000000" w:themeColor="text1" w:sz="2"/>
               <w:bottom w:val="nil"/>
               <w:right w:val="nil"/>
             </w:tcBorders>
@@ -12735,6 +12685,39 @@
         </w:tc>
         <w:tc>
           <w:tcPr>
+            <w:tcW w:w="480" w:type="dxa"/>
+            <w:tcBorders>
+              <w:top w:val="nil"/>
+              <w:left w:val="nil"/>
+              <w:bottom w:val="nil"/>
+              <w:right w:val="nil"/>
+            </w:tcBorders>
+            <w:tcMar>
+              <w:top w:w="45" w:type="dxa"/>
+              <w:left w:w="60" w:type="dxa"/>
+              <w:bottom w:w="45" w:type="dxa"/>
+              <w:right w:w="60" w:type="dxa"/>
+            </w:tcMar>
+            <w:vAlign w:val="top"/>
+          </w:tcPr>
+          <w:p>
+            <w:pPr>
+              <w:jc w:val="center"/>
+              <w:rPr>
+                <w:rFonts w:ascii="Arial" w:hAnsi="Arial" w:eastAsia="Arial" w:cs="Arial"/>
+                <w:b w:val="0"/>
+                <w:bCs w:val="0"/>
+                <w:i w:val="0"/>
+                <w:iCs w:val="0"/>
+                <w:sz w:val="18"/>
+                <w:szCs w:val="18"/>
+                <w:lang w:val="en-IE"/>
+              </w:rPr>
+            </w:pPr>
+          </w:p>
+        </w:tc>
+        <w:tc>
+          <w:tcPr>
             <w:tcW w:w="490" w:type="dxa"/>
             <w:tcBorders>
               <w:top w:val="nil"/>
@@ -12752,15 +12735,15 @@
           </w:tcPr>
           <w:p>
             <w:pPr>
-              <w:jc w:val="left"/>
-              <w:rPr>
-                <w:rFonts w:ascii="Arial" w:hAnsi="Arial" w:eastAsia="Arial" w:cs="Arial"/>
-                <w:b w:val="0"/>
-                <w:bCs w:val="0"/>
-                <w:i w:val="0"/>
-                <w:iCs w:val="0"/>
-                <w:sz w:val="20"/>
-                <w:szCs w:val="20"/>
+              <w:jc w:val="center"/>
+              <w:rPr>
+                <w:rFonts w:ascii="Arial" w:hAnsi="Arial" w:eastAsia="Arial" w:cs="Arial"/>
+                <w:b w:val="0"/>
+                <w:bCs w:val="0"/>
+                <w:i w:val="0"/>
+                <w:iCs w:val="0"/>
+                <w:sz w:val="18"/>
+                <w:szCs w:val="18"/>
                 <w:lang w:val="en-IE"/>
               </w:rPr>
             </w:pPr>
@@ -12768,6 +12751,39 @@
         </w:tc>
         <w:tc>
           <w:tcPr>
+            <w:tcW w:w="499" w:type="dxa"/>
+            <w:tcBorders>
+              <w:top w:val="nil"/>
+              <w:left w:val="nil"/>
+              <w:bottom w:val="nil"/>
+              <w:right w:val="nil"/>
+            </w:tcBorders>
+            <w:tcMar>
+              <w:top w:w="45" w:type="dxa"/>
+              <w:left w:w="60" w:type="dxa"/>
+              <w:bottom w:w="45" w:type="dxa"/>
+              <w:right w:w="60" w:type="dxa"/>
+            </w:tcMar>
+            <w:vAlign w:val="top"/>
+          </w:tcPr>
+          <w:p>
+            <w:pPr>
+              <w:jc w:val="left"/>
+              <w:rPr>
+                <w:rFonts w:ascii="Arial" w:hAnsi="Arial" w:eastAsia="Arial" w:cs="Arial"/>
+                <w:b w:val="0"/>
+                <w:bCs w:val="0"/>
+                <w:i w:val="0"/>
+                <w:iCs w:val="0"/>
+                <w:sz w:val="20"/>
+                <w:szCs w:val="20"/>
+                <w:lang w:val="en-IE"/>
+              </w:rPr>
+            </w:pPr>
+          </w:p>
+        </w:tc>
+        <w:tc>
+          <w:tcPr>
             <w:tcW w:w="505" w:type="dxa"/>
             <w:tcBorders>
               <w:top w:val="nil"/>
@@ -12907,6 +12923,7 @@
               <w:bottom w:val="nil"/>
               <w:right w:val="nil"/>
             </w:tcBorders>
+            <w:shd w:val="clear" w:color="auto" w:fill="4C94D8" w:themeFill="text2" w:themeFillTint="80"/>
             <w:tcMar>
               <w:top w:w="45" w:type="dxa"/>
               <w:left w:w="60" w:type="dxa"/>
@@ -13397,15 +13414,6 @@
               <w:bidi w:val="0"/>
               <w:spacing w:before="0" w:after="0"/>
               <w:jc w:val="left"/>
-              <w:rPr>
-                <w:rFonts w:ascii="Arial" w:hAnsi="Arial" w:eastAsia="Arial" w:cs="Arial"/>
-                <w:b w:val="0"/>
-                <w:bCs w:val="0"/>
-                <w:i w:val="0"/>
-                <w:iCs w:val="0"/>
-                <w:sz w:val="18"/>
-                <w:szCs w:val="18"/>
-              </w:rPr>
             </w:pPr>
             <w:r>
               <w:rPr>
@@ -13418,7 +13426,7 @@
                 <w:szCs w:val="18"/>
                 <w:lang w:val="en-IE"/>
               </w:rPr>
-              <w:t>Deadline day (25/10/2026)</w:t>
+              <w:t>End of the program</w:t>
             </w:r>
           </w:p>
         </w:tc>
@@ -13637,6 +13645,9 @@
     <w:p/>
     <w:p/>
     <w:p/>
+    <w:p/>
+    <w:p/>
+    <w:p/>
     <w:p>
       <w:pPr>
         <w:pStyle w:val="Heading1"/>
@@ -13656,7 +13667,7 @@
         </w:rPr>
         <w:t xml:space="preserve">Please list all the references you have used in your assignment alphabetically and in the Harvard style. You can find information on how to correctly reference in Harvard at this link: </w:t>
       </w:r>
-      <w:hyperlink r:id="R614663b179124a8b">
+      <w:hyperlink r:id="R5b49e12f90904917">
         <w:r>
           <w:rPr>
             <w:rStyle w:val="Hyperlink"/>
@@ -13673,7 +13684,7 @@
       </w:pPr>
     </w:p>
     <w:p>
-      <w:hyperlink r:id="R34b1a23e186b465a">
+      <w:hyperlink r:id="Rf2053326237049ad">
         <w:r>
           <w:rPr>
             <w:rStyle w:val="Hyperlink"/>
@@ -13683,7 +13694,7 @@
       </w:hyperlink>
     </w:p>
     <w:p>
-      <w:hyperlink r:id="Rf23a46fa396b4152">
+      <w:hyperlink r:id="Rd58556514da449be">
         <w:r>
           <w:rPr>
             <w:rStyle w:val="Hyperlink"/>
@@ -13691,6 +13702,44 @@
           <w:t>https://norma.ncirl.ie/9924/1/shashidarvemula.pdf</w:t>
         </w:r>
       </w:hyperlink>
+    </w:p>
+    <w:p>
+      <w:hyperlink r:id="Rf254f7dd2d804a32">
+        <w:r>
+          <w:rPr>
+            <w:rStyle w:val="Hyperlink"/>
+          </w:rPr>
+          <w:t>https://www.centralbank.ie/publication/research-publications/staff-insights/tracing-energy-shocks-through-the-irish-supply-chain--a-new-monitoring-framework</w:t>
+        </w:r>
+      </w:hyperlink>
+    </w:p>
+    <w:p>
+      <w:hyperlink r:id="Rea8cf3ac5db4438b">
+        <w:r>
+          <w:rPr>
+            <w:rStyle w:val="Hyperlink"/>
+          </w:rPr>
+          <w:t>https://researchrepository.universityofgalway.ie/server/api/core/bitstreams/27a12c65-48a4-4b49-bd75-fd505b5c38fc/content</w:t>
+        </w:r>
+      </w:hyperlink>
+    </w:p>
+    <w:p>
+      <w:hyperlink r:id="Rc5e26187f7a64e81">
+        <w:r>
+          <w:rPr>
+            <w:rStyle w:val="Hyperlink"/>
+          </w:rPr>
+          <w:t>https://enterprise.gov.ie/en/publications/publication-files/expert-group-on-global-value-and-supply-chains-final-report.pdf</w:t>
+        </w:r>
+      </w:hyperlink>
+    </w:p>
+    <w:p/>
+    <w:p>
+      <w:pPr>
+        <w:rPr>
+          <w:color w:val="FF0000"/>
+        </w:rPr>
+      </w:pPr>
     </w:p>
     <w:p>
       <w:pPr>
@@ -13761,10 +13810,448 @@
     <w:p/>
     <w:p>
       <w:pPr>
+        <w:pStyle w:val="Normal"/>
+      </w:pPr>
+      <w:r>
         <w:rPr>
-          <w:color w:val="FF0000"/>
+          <w:rFonts w:ascii="system-ui" w:hAnsi="system-ui" w:eastAsia="system-ui" w:cs="system-ui"/>
+          <w:b w:val="0"/>
+          <w:bCs w:val="0"/>
+          <w:i w:val="0"/>
+          <w:iCs w:val="0"/>
+          <w:caps w:val="0"/>
+          <w:smallCaps w:val="0"/>
+          <w:noProof w:val="0"/>
+          <w:color w:val="0C274A"/>
+          <w:sz w:val="24"/>
+          <w:szCs w:val="24"/>
+          <w:lang w:val="en-IE"/>
         </w:rPr>
-      </w:pPr>
+        <w:t>com base no que conversamos, com base no Capstone project o que acha do tema Predicting Logistics Bottlenecks: A Data-Driven Analysis of Supply Chain Delays</w:t>
+      </w:r>
+    </w:p>
+    <w:p>
+      <w:pPr>
+        <w:pStyle w:val="Normal"/>
+        <w:rPr>
+          <w:rFonts w:ascii="system-ui" w:hAnsi="system-ui" w:eastAsia="system-ui" w:cs="system-ui"/>
+          <w:b w:val="0"/>
+          <w:bCs w:val="0"/>
+          <w:i w:val="0"/>
+          <w:iCs w:val="0"/>
+          <w:caps w:val="0"/>
+          <w:smallCaps w:val="0"/>
+          <w:noProof w:val="0"/>
+          <w:color w:val="0C274A"/>
+          <w:sz w:val="24"/>
+          <w:szCs w:val="24"/>
+          <w:lang w:val="en-IE"/>
+        </w:rPr>
+      </w:pPr>
+    </w:p>
+    <w:p>
+      <w:pPr>
+        <w:pStyle w:val="Normal"/>
+      </w:pPr>
+      <w:r>
+        <w:rPr>
+          <w:rFonts w:ascii="system-ui" w:hAnsi="system-ui" w:eastAsia="system-ui" w:cs="system-ui"/>
+          <w:b w:val="0"/>
+          <w:bCs w:val="0"/>
+          <w:i w:val="0"/>
+          <w:iCs w:val="0"/>
+          <w:caps w:val="0"/>
+          <w:smallCaps w:val="0"/>
+          <w:noProof w:val="0"/>
+          <w:color w:val="0C274A"/>
+          <w:sz w:val="24"/>
+          <w:szCs w:val="24"/>
+          <w:lang w:val="en-IE"/>
+        </w:rPr>
+        <w:t xml:space="preserve">e a Predicting the Consumer Impact of Supply Chain Disruptions e possivel ser um tema de publicacao </w:t>
+      </w:r>
+    </w:p>
+    <w:p>
+      <w:pPr>
+        <w:pStyle w:val="Normal"/>
+        <w:rPr>
+          <w:rFonts w:ascii="system-ui" w:hAnsi="system-ui" w:eastAsia="system-ui" w:cs="system-ui"/>
+          <w:b w:val="0"/>
+          <w:bCs w:val="0"/>
+          <w:i w:val="0"/>
+          <w:iCs w:val="0"/>
+          <w:caps w:val="0"/>
+          <w:smallCaps w:val="0"/>
+          <w:noProof w:val="0"/>
+          <w:color w:val="0C274A"/>
+          <w:sz w:val="24"/>
+          <w:szCs w:val="24"/>
+          <w:lang w:val="en-IE"/>
+        </w:rPr>
+      </w:pPr>
+    </w:p>
+    <w:p>
+      <w:pPr>
+        <w:pStyle w:val="Normal"/>
+      </w:pPr>
+      <w:r>
+        <w:rPr>
+          <w:rFonts w:ascii="system-ui" w:hAnsi="system-ui" w:eastAsia="system-ui" w:cs="system-ui"/>
+          <w:b w:val="0"/>
+          <w:bCs w:val="0"/>
+          <w:i w:val="0"/>
+          <w:iCs w:val="0"/>
+          <w:caps w:val="0"/>
+          <w:smallCaps w:val="0"/>
+          <w:noProof w:val="0"/>
+          <w:color w:val="0C274A"/>
+          <w:sz w:val="24"/>
+          <w:szCs w:val="24"/>
+          <w:lang w:val="en-IE"/>
+        </w:rPr>
+        <w:t xml:space="preserve">Quais </w:t>
+      </w:r>
+      <w:r>
+        <w:rPr>
+          <w:rFonts w:ascii="system-ui" w:hAnsi="system-ui" w:eastAsia="system-ui" w:cs="system-ui"/>
+          <w:b w:val="0"/>
+          <w:bCs w:val="0"/>
+          <w:i w:val="0"/>
+          <w:iCs w:val="0"/>
+          <w:caps w:val="0"/>
+          <w:smallCaps w:val="0"/>
+          <w:noProof w:val="0"/>
+          <w:color w:val="0C274A"/>
+          <w:sz w:val="24"/>
+          <w:szCs w:val="24"/>
+          <w:lang w:val="en-IE"/>
+        </w:rPr>
+        <w:t>sao</w:t>
+      </w:r>
+      <w:r>
+        <w:rPr>
+          <w:rFonts w:ascii="system-ui" w:hAnsi="system-ui" w:eastAsia="system-ui" w:cs="system-ui"/>
+          <w:b w:val="0"/>
+          <w:bCs w:val="0"/>
+          <w:i w:val="0"/>
+          <w:iCs w:val="0"/>
+          <w:caps w:val="0"/>
+          <w:smallCaps w:val="0"/>
+          <w:noProof w:val="0"/>
+          <w:color w:val="0C274A"/>
+          <w:sz w:val="24"/>
+          <w:szCs w:val="24"/>
+          <w:lang w:val="en-IE"/>
+        </w:rPr>
+        <w:t xml:space="preserve"> as </w:t>
+      </w:r>
+      <w:r>
+        <w:rPr>
+          <w:rFonts w:ascii="system-ui" w:hAnsi="system-ui" w:eastAsia="system-ui" w:cs="system-ui"/>
+          <w:b w:val="0"/>
+          <w:bCs w:val="0"/>
+          <w:i w:val="0"/>
+          <w:iCs w:val="0"/>
+          <w:caps w:val="0"/>
+          <w:smallCaps w:val="0"/>
+          <w:noProof w:val="0"/>
+          <w:color w:val="0C274A"/>
+          <w:sz w:val="24"/>
+          <w:szCs w:val="24"/>
+          <w:lang w:val="en-IE"/>
+        </w:rPr>
+        <w:t>fontes</w:t>
+      </w:r>
+      <w:r>
+        <w:rPr>
+          <w:rFonts w:ascii="system-ui" w:hAnsi="system-ui" w:eastAsia="system-ui" w:cs="system-ui"/>
+          <w:b w:val="0"/>
+          <w:bCs w:val="0"/>
+          <w:i w:val="0"/>
+          <w:iCs w:val="0"/>
+          <w:caps w:val="0"/>
+          <w:smallCaps w:val="0"/>
+          <w:noProof w:val="0"/>
+          <w:color w:val="0C274A"/>
+          <w:sz w:val="24"/>
+          <w:szCs w:val="24"/>
+          <w:lang w:val="en-IE"/>
+        </w:rPr>
+        <w:t xml:space="preserve"> confiaveis para esses dados </w:t>
+      </w:r>
+    </w:p>
+    <w:p>
+      <w:pPr>
+        <w:pStyle w:val="Normal"/>
+        <w:rPr>
+          <w:rFonts w:ascii="system-ui" w:hAnsi="system-ui" w:eastAsia="system-ui" w:cs="system-ui"/>
+          <w:b w:val="0"/>
+          <w:bCs w:val="0"/>
+          <w:i w:val="0"/>
+          <w:iCs w:val="0"/>
+          <w:caps w:val="0"/>
+          <w:smallCaps w:val="0"/>
+          <w:noProof w:val="0"/>
+          <w:color w:val="0C274A"/>
+          <w:sz w:val="24"/>
+          <w:szCs w:val="24"/>
+          <w:lang w:val="en-IE"/>
+        </w:rPr>
+      </w:pPr>
+    </w:p>
+    <w:p>
+      <w:pPr>
+        <w:pStyle w:val="Normal"/>
+      </w:pPr>
+      <w:r>
+        <w:rPr>
+          <w:rFonts w:ascii="system-ui" w:hAnsi="system-ui" w:eastAsia="system-ui" w:cs="system-ui"/>
+          <w:b w:val="0"/>
+          <w:bCs w:val="0"/>
+          <w:i w:val="0"/>
+          <w:iCs w:val="0"/>
+          <w:caps w:val="0"/>
+          <w:smallCaps w:val="0"/>
+          <w:noProof w:val="0"/>
+          <w:color w:val="0C274A"/>
+          <w:sz w:val="24"/>
+          <w:szCs w:val="24"/>
+          <w:lang w:val="pt-BR"/>
+        </w:rPr>
+        <w:t>mas eu preciso baixar todas esses dados eu estou confusa em qual focar</w:t>
+      </w:r>
+    </w:p>
+    <w:p>
+      <w:pPr>
+        <w:pStyle w:val="Normal"/>
+        <w:rPr>
+          <w:rFonts w:ascii="system-ui" w:hAnsi="system-ui" w:eastAsia="system-ui" w:cs="system-ui"/>
+          <w:b w:val="0"/>
+          <w:bCs w:val="0"/>
+          <w:i w:val="0"/>
+          <w:iCs w:val="0"/>
+          <w:caps w:val="0"/>
+          <w:smallCaps w:val="0"/>
+          <w:noProof w:val="0"/>
+          <w:color w:val="0C274A"/>
+          <w:sz w:val="24"/>
+          <w:szCs w:val="24"/>
+          <w:lang w:val="pt-BR"/>
+        </w:rPr>
+      </w:pPr>
+    </w:p>
+    <w:p>
+      <w:pPr>
+        <w:pStyle w:val="Normal"/>
+      </w:pPr>
+      <w:r>
+        <w:rPr>
+          <w:rFonts w:ascii="system-ui" w:hAnsi="system-ui" w:eastAsia="system-ui" w:cs="system-ui"/>
+          <w:b w:val="0"/>
+          <w:bCs w:val="0"/>
+          <w:i w:val="0"/>
+          <w:iCs w:val="0"/>
+          <w:caps w:val="0"/>
+          <w:smallCaps w:val="0"/>
+          <w:noProof w:val="0"/>
+          <w:color w:val="0C274A"/>
+          <w:sz w:val="24"/>
+          <w:szCs w:val="24"/>
+          <w:lang w:val="pt-BR"/>
+        </w:rPr>
+        <w:t>Tem várias consumer price index como saber qual é a certa ? A CPI consumer price index que você falou não existe e sim CPA e CPM mas elas tem informações de tabaco e álcool</w:t>
+      </w:r>
+    </w:p>
+    <w:p>
+      <w:pPr>
+        <w:pStyle w:val="Normal"/>
+        <w:rPr>
+          <w:rFonts w:ascii="system-ui" w:hAnsi="system-ui" w:eastAsia="system-ui" w:cs="system-ui"/>
+          <w:b w:val="0"/>
+          <w:bCs w:val="0"/>
+          <w:i w:val="0"/>
+          <w:iCs w:val="0"/>
+          <w:caps w:val="0"/>
+          <w:smallCaps w:val="0"/>
+          <w:noProof w:val="0"/>
+          <w:color w:val="0C274A"/>
+          <w:sz w:val="24"/>
+          <w:szCs w:val="24"/>
+          <w:lang w:val="pt-BR"/>
+        </w:rPr>
+      </w:pPr>
+    </w:p>
+    <w:p>
+      <w:pPr>
+        <w:pStyle w:val="Normal"/>
+      </w:pPr>
+      <w:r>
+        <w:rPr>
+          <w:rFonts w:ascii="system-ui" w:hAnsi="system-ui" w:eastAsia="system-ui" w:cs="system-ui"/>
+          <w:b w:val="0"/>
+          <w:bCs w:val="0"/>
+          <w:i w:val="0"/>
+          <w:iCs w:val="0"/>
+          <w:caps w:val="0"/>
+          <w:smallCaps w:val="0"/>
+          <w:noProof w:val="0"/>
+          <w:color w:val="0C274A"/>
+          <w:sz w:val="24"/>
+          <w:szCs w:val="24"/>
+          <w:lang w:val="pt-BR"/>
+        </w:rPr>
+        <w:t>eu nao preciso de informacao de transporte ja que o trabalho e demonstrar o impacto no consumidor dercorrente do transporte</w:t>
+      </w:r>
+    </w:p>
+    <w:p>
+      <w:pPr>
+        <w:pStyle w:val="Normal"/>
+        <w:rPr>
+          <w:rFonts w:ascii="system-ui" w:hAnsi="system-ui" w:eastAsia="system-ui" w:cs="system-ui"/>
+          <w:b w:val="0"/>
+          <w:bCs w:val="0"/>
+          <w:i w:val="0"/>
+          <w:iCs w:val="0"/>
+          <w:caps w:val="0"/>
+          <w:smallCaps w:val="0"/>
+          <w:noProof w:val="0"/>
+          <w:color w:val="0C274A"/>
+          <w:sz w:val="24"/>
+          <w:szCs w:val="24"/>
+          <w:lang w:val="pt-BR"/>
+        </w:rPr>
+      </w:pPr>
+    </w:p>
+    <w:p>
+      <w:pPr>
+        <w:pStyle w:val="Normal"/>
+      </w:pPr>
+      <w:r>
+        <w:rPr>
+          <w:rFonts w:ascii="system-ui" w:hAnsi="system-ui" w:eastAsia="system-ui" w:cs="system-ui"/>
+          <w:b w:val="0"/>
+          <w:bCs w:val="0"/>
+          <w:i w:val="0"/>
+          <w:iCs w:val="0"/>
+          <w:caps w:val="0"/>
+          <w:smallCaps w:val="0"/>
+          <w:noProof w:val="0"/>
+          <w:color w:val="0C274A"/>
+          <w:sz w:val="24"/>
+          <w:szCs w:val="24"/>
+          <w:lang w:val="pt-BR"/>
+        </w:rPr>
+        <w:t>Como fica a metodologia do meu trabalho , Posso incluir trabalhos publicados ou artigos na minha metodologia</w:t>
+      </w:r>
+    </w:p>
+    <w:p>
+      <w:pPr>
+        <w:pStyle w:val="Normal"/>
+        <w:rPr>
+          <w:rFonts w:ascii="system-ui" w:hAnsi="system-ui" w:eastAsia="system-ui" w:cs="system-ui"/>
+          <w:b w:val="0"/>
+          <w:bCs w:val="0"/>
+          <w:i w:val="0"/>
+          <w:iCs w:val="0"/>
+          <w:caps w:val="0"/>
+          <w:smallCaps w:val="0"/>
+          <w:noProof w:val="0"/>
+          <w:color w:val="0C274A"/>
+          <w:sz w:val="24"/>
+          <w:szCs w:val="24"/>
+          <w:lang w:val="pt-BR"/>
+        </w:rPr>
+      </w:pPr>
+    </w:p>
+    <w:p>
+      <w:pPr>
+        <w:pStyle w:val="Normal"/>
+      </w:pPr>
+      <w:r>
+        <w:rPr>
+          <w:rFonts w:ascii="system-ui" w:hAnsi="system-ui" w:eastAsia="system-ui" w:cs="system-ui"/>
+          <w:b w:val="0"/>
+          <w:bCs w:val="0"/>
+          <w:i w:val="0"/>
+          <w:iCs w:val="0"/>
+          <w:caps w:val="0"/>
+          <w:smallCaps w:val="0"/>
+          <w:noProof w:val="0"/>
+          <w:color w:val="0C274A"/>
+          <w:sz w:val="24"/>
+          <w:szCs w:val="24"/>
+          <w:lang w:val="pt-BR"/>
+        </w:rPr>
+        <w:t xml:space="preserve">Com base no meu projeto primeira e segunda parte o que precisa ir como </w:t>
+      </w:r>
+      <w:r>
+        <w:rPr>
+          <w:rFonts w:ascii="system-ui" w:hAnsi="system-ui" w:eastAsia="system-ui" w:cs="system-ui"/>
+          <w:b w:val="0"/>
+          <w:bCs w:val="0"/>
+          <w:i w:val="0"/>
+          <w:iCs w:val="0"/>
+          <w:caps w:val="0"/>
+          <w:smallCaps w:val="0"/>
+          <w:noProof w:val="0"/>
+          <w:color w:val="0C274A"/>
+          <w:sz w:val="24"/>
+          <w:szCs w:val="24"/>
+          <w:lang w:val="pt-BR"/>
+        </w:rPr>
+        <w:t>topico</w:t>
+      </w:r>
+      <w:r>
+        <w:rPr>
+          <w:rFonts w:ascii="system-ui" w:hAnsi="system-ui" w:eastAsia="system-ui" w:cs="system-ui"/>
+          <w:b w:val="0"/>
+          <w:bCs w:val="0"/>
+          <w:i w:val="0"/>
+          <w:iCs w:val="0"/>
+          <w:caps w:val="0"/>
+          <w:smallCaps w:val="0"/>
+          <w:noProof w:val="0"/>
+          <w:color w:val="0C274A"/>
+          <w:sz w:val="24"/>
+          <w:szCs w:val="24"/>
+          <w:lang w:val="pt-BR"/>
+        </w:rPr>
+        <w:t xml:space="preserve"> no </w:t>
+      </w:r>
+      <w:r>
+        <w:rPr>
+          <w:rFonts w:ascii="system-ui" w:hAnsi="system-ui" w:eastAsia="system-ui" w:cs="system-ui"/>
+          <w:b w:val="0"/>
+          <w:bCs w:val="0"/>
+          <w:i w:val="0"/>
+          <w:iCs w:val="0"/>
+          <w:caps w:val="0"/>
+          <w:smallCaps w:val="0"/>
+          <w:noProof w:val="0"/>
+          <w:color w:val="0C274A"/>
+          <w:sz w:val="24"/>
+          <w:szCs w:val="24"/>
+          <w:lang w:val="pt-BR"/>
+        </w:rPr>
+        <w:t>grafico</w:t>
+      </w:r>
+      <w:r>
+        <w:rPr>
+          <w:rFonts w:ascii="system-ui" w:hAnsi="system-ui" w:eastAsia="system-ui" w:cs="system-ui"/>
+          <w:b w:val="0"/>
+          <w:bCs w:val="0"/>
+          <w:i w:val="0"/>
+          <w:iCs w:val="0"/>
+          <w:caps w:val="0"/>
+          <w:smallCaps w:val="0"/>
+          <w:noProof w:val="0"/>
+          <w:color w:val="0C274A"/>
+          <w:sz w:val="24"/>
+          <w:szCs w:val="24"/>
+          <w:lang w:val="pt-BR"/>
+        </w:rPr>
+        <w:t xml:space="preserve"> de gantt</w:t>
+      </w:r>
     </w:p>
     <w:p>
       <w:pPr>

</xml_diff>